<commit_message>
docs: update PP1 documents with interactive thread features and viva prep
</commit_message>
<xml_diff>
--- a/docs/Progress-1-UI-Business-Rules.docx
+++ b/docs/Progress-1-UI-Business-Rules.docx
@@ -7,7 +7,7 @@
         <w:pStyle w:val="Title"/>
       </w:pPr>
       <w:r>
-        <w:t>Progress 1 — UI and Business Rules Document</w:t>
+        <w:t>Progress 1 - UI and Business Rules Document</w:t>
       </w:r>
     </w:p>
     <w:p>
@@ -15,7 +15,7 @@
         <w:rPr>
           <w:b w:val="0"/>
         </w:rPr>
-        <w:t>Module: IT3040 – ITPM | Semester 1</w:t>
+        <w:t>Module: IT3040 - ITPM | Semester 1</w:t>
       </w:r>
     </w:p>
     <w:p>
@@ -23,7 +23,7 @@
         <w:rPr>
           <w:b w:val="0"/>
         </w:rPr>
-        <w:t>Programme: BSc (Hons) in Information Technology — Year 3</w:t>
+        <w:t>Programme: BSc (Hons) in Information Technology - Year 3</w:t>
       </w:r>
     </w:p>
     <w:p>
@@ -195,7 +195,7 @@
               <w:rPr>
                 <w:sz w:val="20"/>
               </w:rPr>
-              <w:t>A web module that lets students submit project ideas with form validation, receive recursive threaded feedback from mentors and peers with Markdown/code support, and view guidance threads per project with upvote and accept interactions.</w:t>
+              <w:t>A web module for submitting project ideas with validation, interactive recursive threaded feedback with Markdown/code support, and guidance threads with live commenting, replying, upvote and accept interactions.</w:t>
             </w:r>
           </w:p>
         </w:tc>
@@ -425,7 +425,7 @@
               <w:rPr>
                 <w:sz w:val="20"/>
               </w:rPr>
-              <w:t>/posts/new (short title)</w:t>
+              <w:t>/posts/new (short)</w:t>
             </w:r>
           </w:p>
         </w:tc>
@@ -466,7 +466,7 @@
               <w:rPr>
                 <w:sz w:val="20"/>
               </w:rPr>
-              <w:t>Form Filled with Valid Data</w:t>
+              <w:t>Form Filled</w:t>
             </w:r>
           </w:p>
         </w:tc>
@@ -479,7 +479,7 @@
               <w:rPr>
                 <w:sz w:val="20"/>
               </w:rPr>
-              <w:t>/posts/new (completed)</w:t>
+              <w:t>/posts/new (filled)</w:t>
             </w:r>
           </w:p>
         </w:tc>
@@ -520,7 +520,7 @@
               <w:rPr>
                 <w:sz w:val="20"/>
               </w:rPr>
-              <w:t>Successful Submission</w:t>
+              <w:t>Submission Success</w:t>
             </w:r>
           </w:p>
         </w:tc>
@@ -749,7 +749,7 @@
               <w:rPr>
                 <w:sz w:val="20"/>
               </w:rPr>
-              <w:t>/guidance/[projectId] (toggled)</w:t>
+              <w:t>/guidance/[projectId]</w:t>
             </w:r>
           </w:p>
         </w:tc>
@@ -763,6 +763,330 @@
                 <w:sz w:val="20"/>
               </w:rPr>
               <w:t>09-guidance-interactions.png</w:t>
+            </w:r>
+          </w:p>
+        </w:tc>
+      </w:tr>
+      <w:tr>
+        <w:tc>
+          <w:tcPr>
+            <w:tcW w:type="dxa" w:w="2160"/>
+          </w:tcPr>
+          <w:p>
+            <w:r>
+              <w:rPr>
+                <w:sz w:val="20"/>
+              </w:rPr>
+              <w:t>UI 10</w:t>
+            </w:r>
+          </w:p>
+        </w:tc>
+        <w:tc>
+          <w:tcPr>
+            <w:tcW w:type="dxa" w:w="2160"/>
+          </w:tcPr>
+          <w:p>
+            <w:r>
+              <w:rPr>
+                <w:sz w:val="20"/>
+              </w:rPr>
+              <w:t>Interactive Feedback Form</w:t>
+            </w:r>
+          </w:p>
+        </w:tc>
+        <w:tc>
+          <w:tcPr>
+            <w:tcW w:type="dxa" w:w="2160"/>
+          </w:tcPr>
+          <w:p>
+            <w:r>
+              <w:rPr>
+                <w:sz w:val="20"/>
+              </w:rPr>
+              <w:t>/feedback (interactive)</w:t>
+            </w:r>
+          </w:p>
+        </w:tc>
+        <w:tc>
+          <w:tcPr>
+            <w:tcW w:type="dxa" w:w="2160"/>
+          </w:tcPr>
+          <w:p>
+            <w:r>
+              <w:rPr>
+                <w:sz w:val="20"/>
+              </w:rPr>
+              <w:t>10-feedback-interactive-form.png</w:t>
+            </w:r>
+          </w:p>
+        </w:tc>
+      </w:tr>
+      <w:tr>
+        <w:tc>
+          <w:tcPr>
+            <w:tcW w:type="dxa" w:w="2160"/>
+          </w:tcPr>
+          <w:p>
+            <w:r>
+              <w:rPr>
+                <w:sz w:val="20"/>
+              </w:rPr>
+              <w:t>UI 11</w:t>
+            </w:r>
+          </w:p>
+        </w:tc>
+        <w:tc>
+          <w:tcPr>
+            <w:tcW w:type="dxa" w:w="2160"/>
+          </w:tcPr>
+          <w:p>
+            <w:r>
+              <w:rPr>
+                <w:sz w:val="20"/>
+              </w:rPr>
+              <w:t>Feedback Reply Form</w:t>
+            </w:r>
+          </w:p>
+        </w:tc>
+        <w:tc>
+          <w:tcPr>
+            <w:tcW w:type="dxa" w:w="2160"/>
+          </w:tcPr>
+          <w:p>
+            <w:r>
+              <w:rPr>
+                <w:sz w:val="20"/>
+              </w:rPr>
+              <w:t>/feedback (reply)</w:t>
+            </w:r>
+          </w:p>
+        </w:tc>
+        <w:tc>
+          <w:tcPr>
+            <w:tcW w:type="dxa" w:w="2160"/>
+          </w:tcPr>
+          <w:p>
+            <w:r>
+              <w:rPr>
+                <w:sz w:val="20"/>
+              </w:rPr>
+              <w:t>11-feedback-reply-form.png</w:t>
+            </w:r>
+          </w:p>
+        </w:tc>
+      </w:tr>
+      <w:tr>
+        <w:tc>
+          <w:tcPr>
+            <w:tcW w:type="dxa" w:w="2160"/>
+          </w:tcPr>
+          <w:p>
+            <w:r>
+              <w:rPr>
+                <w:sz w:val="20"/>
+              </w:rPr>
+              <w:t>UI 12</w:t>
+            </w:r>
+          </w:p>
+        </w:tc>
+        <w:tc>
+          <w:tcPr>
+            <w:tcW w:type="dxa" w:w="2160"/>
+          </w:tcPr>
+          <w:p>
+            <w:r>
+              <w:rPr>
+                <w:sz w:val="20"/>
+              </w:rPr>
+              <w:t>Feedback Reply Posted</w:t>
+            </w:r>
+          </w:p>
+        </w:tc>
+        <w:tc>
+          <w:tcPr>
+            <w:tcW w:type="dxa" w:w="2160"/>
+          </w:tcPr>
+          <w:p>
+            <w:r>
+              <w:rPr>
+                <w:sz w:val="20"/>
+              </w:rPr>
+              <w:t>/feedback (nested reply)</w:t>
+            </w:r>
+          </w:p>
+        </w:tc>
+        <w:tc>
+          <w:tcPr>
+            <w:tcW w:type="dxa" w:w="2160"/>
+          </w:tcPr>
+          <w:p>
+            <w:r>
+              <w:rPr>
+                <w:sz w:val="20"/>
+              </w:rPr>
+              <w:t>12-feedback-reply-posted.png</w:t>
+            </w:r>
+          </w:p>
+        </w:tc>
+      </w:tr>
+      <w:tr>
+        <w:tc>
+          <w:tcPr>
+            <w:tcW w:type="dxa" w:w="2160"/>
+          </w:tcPr>
+          <w:p>
+            <w:r>
+              <w:rPr>
+                <w:sz w:val="20"/>
+              </w:rPr>
+              <w:t>UI 13</w:t>
+            </w:r>
+          </w:p>
+        </w:tc>
+        <w:tc>
+          <w:tcPr>
+            <w:tcW w:type="dxa" w:w="2160"/>
+          </w:tcPr>
+          <w:p>
+            <w:r>
+              <w:rPr>
+                <w:sz w:val="20"/>
+              </w:rPr>
+              <w:t>New Root Comment</w:t>
+            </w:r>
+          </w:p>
+        </w:tc>
+        <w:tc>
+          <w:tcPr>
+            <w:tcW w:type="dxa" w:w="2160"/>
+          </w:tcPr>
+          <w:p>
+            <w:r>
+              <w:rPr>
+                <w:sz w:val="20"/>
+              </w:rPr>
+              <w:t>/feedback (new comment)</w:t>
+            </w:r>
+          </w:p>
+        </w:tc>
+        <w:tc>
+          <w:tcPr>
+            <w:tcW w:type="dxa" w:w="2160"/>
+          </w:tcPr>
+          <w:p>
+            <w:r>
+              <w:rPr>
+                <w:sz w:val="20"/>
+              </w:rPr>
+              <w:t>13-feedback-new-comment.png</w:t>
+            </w:r>
+          </w:p>
+        </w:tc>
+      </w:tr>
+      <w:tr>
+        <w:tc>
+          <w:tcPr>
+            <w:tcW w:type="dxa" w:w="2160"/>
+          </w:tcPr>
+          <w:p>
+            <w:r>
+              <w:rPr>
+                <w:sz w:val="20"/>
+              </w:rPr>
+              <w:t>UI 14</w:t>
+            </w:r>
+          </w:p>
+        </w:tc>
+        <w:tc>
+          <w:tcPr>
+            <w:tcW w:type="dxa" w:w="2160"/>
+          </w:tcPr>
+          <w:p>
+            <w:r>
+              <w:rPr>
+                <w:sz w:val="20"/>
+              </w:rPr>
+              <w:t>Interactive Guidance</w:t>
+            </w:r>
+          </w:p>
+        </w:tc>
+        <w:tc>
+          <w:tcPr>
+            <w:tcW w:type="dxa" w:w="2160"/>
+          </w:tcPr>
+          <w:p>
+            <w:r>
+              <w:rPr>
+                <w:sz w:val="20"/>
+              </w:rPr>
+              <w:t>/guidance/1 (interactive)</w:t>
+            </w:r>
+          </w:p>
+        </w:tc>
+        <w:tc>
+          <w:tcPr>
+            <w:tcW w:type="dxa" w:w="2160"/>
+          </w:tcPr>
+          <w:p>
+            <w:r>
+              <w:rPr>
+                <w:sz w:val="20"/>
+              </w:rPr>
+              <w:t>14-guidance-interactive.png</w:t>
+            </w:r>
+          </w:p>
+        </w:tc>
+      </w:tr>
+      <w:tr>
+        <w:tc>
+          <w:tcPr>
+            <w:tcW w:type="dxa" w:w="2160"/>
+          </w:tcPr>
+          <w:p>
+            <w:r>
+              <w:rPr>
+                <w:sz w:val="20"/>
+              </w:rPr>
+              <w:t>UI 15</w:t>
+            </w:r>
+          </w:p>
+        </w:tc>
+        <w:tc>
+          <w:tcPr>
+            <w:tcW w:type="dxa" w:w="2160"/>
+          </w:tcPr>
+          <w:p>
+            <w:r>
+              <w:rPr>
+                <w:sz w:val="20"/>
+              </w:rPr>
+              <w:t>Guidance Reply Form</w:t>
+            </w:r>
+          </w:p>
+        </w:tc>
+        <w:tc>
+          <w:tcPr>
+            <w:tcW w:type="dxa" w:w="2160"/>
+          </w:tcPr>
+          <w:p>
+            <w:r>
+              <w:rPr>
+                <w:sz w:val="20"/>
+              </w:rPr>
+              <w:t>/guidance/1 (reply)</w:t>
+            </w:r>
+          </w:p>
+        </w:tc>
+        <w:tc>
+          <w:tcPr>
+            <w:tcW w:type="dxa" w:w="2160"/>
+          </w:tcPr>
+          <w:p>
+            <w:r>
+              <w:rPr>
+                <w:sz w:val="20"/>
+              </w:rPr>
+              <w:t>15-guidance-reply-form.png</w:t>
             </w:r>
           </w:p>
         </w:tc>
@@ -1416,7 +1740,7 @@
               <w:rPr>
                 <w:sz w:val="20"/>
               </w:rPr>
-              <w:t>Required. Must be one of 4 values.</w:t>
+              <w:t>Required. One of 4 values.</w:t>
             </w:r>
           </w:p>
         </w:tc>
@@ -1470,7 +1794,7 @@
               <w:rPr>
                 <w:sz w:val="20"/>
               </w:rPr>
-              <w:t>Optional. Each must be valid URL.</w:t>
+              <w:t>Optional. Valid URL format.</w:t>
             </w:r>
           </w:p>
         </w:tc>
@@ -1483,7 +1807,7 @@
               <w:rPr>
                 <w:sz w:val="20"/>
               </w:rPr>
-              <w:t>"Each URL must be valid (e.g. https://…)"</w:t>
+              <w:t>"Each URL must be valid"</w:t>
             </w:r>
           </w:p>
         </w:tc>
@@ -1537,7 +1861,7 @@
               <w:rPr>
                 <w:sz w:val="20"/>
               </w:rPr>
-              <w:t>—</w:t>
+              <w:t>-</w:t>
             </w:r>
           </w:p>
         </w:tc>
@@ -1578,7 +1902,7 @@
               <w:rPr>
                 <w:sz w:val="20"/>
               </w:rPr>
-              <w:t>Validated via Zod safeParse(). Errors inline in red.</w:t>
+              <w:t>Zod safeParse(). Inline red errors.</w:t>
             </w:r>
           </w:p>
         </w:tc>
@@ -1591,7 +1915,7 @@
               <w:rPr>
                 <w:sz w:val="20"/>
               </w:rPr>
-              <w:t>—</w:t>
+              <w:t>-</w:t>
             </w:r>
           </w:p>
         </w:tc>
@@ -1655,7 +1979,7 @@
           <w:color w:val="646464"/>
           <w:sz w:val="18"/>
         </w:rPr>
-        <w:t>Figure 2: Empty submit → "Title is required", "Problem statement is required", "Please select a project variant"</w:t>
+        <w:t>Figure 2: Empty submit showing 3 validation errors</w:t>
       </w:r>
     </w:p>
     <w:p>
@@ -1707,7 +2031,7 @@
           <w:color w:val="646464"/>
           <w:sz w:val="18"/>
         </w:rPr>
-        <w:t>Figure 3: Short title "test" → "Title must be at least 10 characters"</w:t>
+        <w:t>Figure 3: "Title must be at least 10 characters"</w:t>
       </w:r>
     </w:p>
     <w:p>
@@ -1782,7 +2106,7 @@
               <w:rPr>
                 <w:sz w:val="20"/>
               </w:rPr>
-              <w:t>User fills fields → clicks Submit Idea → Zod validates → if valid, returns success.</w:t>
+              <w:t>User fills fields -&gt; Submit Idea -&gt; Zod validates -&gt; success response.</w:t>
             </w:r>
           </w:p>
         </w:tc>
@@ -1810,7 +2134,7 @@
               <w:rPr>
                 <w:sz w:val="20"/>
               </w:rPr>
-              <w:t>Success: green banner shows submitted data in JSON format.</w:t>
+              <w:t>Success: green banner shows submitted JSON data.</w:t>
             </w:r>
           </w:p>
         </w:tc>
@@ -1838,7 +2162,7 @@
               <w:rPr>
                 <w:sz w:val="20"/>
               </w:rPr>
-              <w:t>Failure: form re-renders with inline red error messages. Entered data preserved.</w:t>
+              <w:t>Failure: inline red error messages. Entered data preserved.</w:t>
             </w:r>
           </w:p>
         </w:tc>
@@ -1866,7 +2190,7 @@
               <w:rPr>
                 <w:sz w:val="20"/>
               </w:rPr>
-              <w:t>Submit button shows "Submitting…" and disables during processing (useFormStatus).</w:t>
+              <w:t>Submit button shows "Submitting..." and disables (useFormStatus).</w:t>
             </w:r>
           </w:p>
         </w:tc>
@@ -1930,7 +2254,7 @@
           <w:color w:val="646464"/>
           <w:sz w:val="18"/>
         </w:rPr>
-        <w:t>Figure 4: Filled form — title, problem statement, Prototype variant, 4 tech tags selected</w:t>
+        <w:t>Figure 4: Filled form with Prototype variant and 4 tech tags</w:t>
       </w:r>
     </w:p>
     <w:p>
@@ -1982,7 +2306,7 @@
           <w:color w:val="646464"/>
           <w:sz w:val="18"/>
         </w:rPr>
-        <w:t>Figure 5: Success banner — "Project idea submitted successfully!" with JSON output</w:t>
+        <w:t>Figure 5: "Project idea submitted successfully!" with JSON</w:t>
       </w:r>
     </w:p>
     <w:p>
@@ -1990,7 +2314,7 @@
         <w:pStyle w:val="Heading2"/>
       </w:pPr>
       <w:r>
-        <w:t>Tag Picker Interaction Rules</w:t>
+        <w:t>Tag Picker Rules</w:t>
       </w:r>
     </w:p>
     <w:tbl>
@@ -2057,7 +2381,7 @@
               <w:rPr>
                 <w:sz w:val="20"/>
               </w:rPr>
-              <w:t>Tags displayed as pill-shaped buttons in a horizontal row.</w:t>
+              <w:t>Pill-shaped buttons in a horizontal row.</w:t>
             </w:r>
           </w:p>
         </w:tc>
@@ -2085,7 +2409,7 @@
               <w:rPr>
                 <w:sz w:val="20"/>
               </w:rPr>
-              <w:t>Click toggles: unselected (white) → selected (blue filled).</w:t>
+              <w:t>Click toggles: white (off) -&gt; blue filled (on).</w:t>
             </w:r>
           </w:p>
         </w:tc>
@@ -2113,7 +2437,7 @@
               <w:rPr>
                 <w:sz w:val="20"/>
               </w:rPr>
-              <w:t>Counter shows "N selected" in real-time.</w:t>
+              <w:t>"N selected" counter updates in real-time.</w:t>
             </w:r>
           </w:p>
         </w:tc>
@@ -2141,7 +2465,7 @@
               <w:rPr>
                 <w:sz w:val="20"/>
               </w:rPr>
-              <w:t>Selected tags serialized as JSON in hidden input for form submission.</w:t>
+              <w:t>Selected tags serialized as JSON in hidden input.</w:t>
             </w:r>
           </w:p>
         </w:tc>
@@ -2169,7 +2493,7 @@
               <w:rPr>
                 <w:sz w:val="20"/>
               </w:rPr>
-              <w:t>Tag state managed using Set&lt;string&gt; in useState.</w:t>
+              <w:t>State managed using Set&lt;string&gt; in useState.</w:t>
             </w:r>
           </w:p>
         </w:tc>
@@ -2181,7 +2505,7 @@
         <w:pStyle w:val="Heading2"/>
       </w:pPr>
       <w:r>
-        <w:t>URL List Interaction Rules</w:t>
+        <w:t>URL List Rules</w:t>
       </w:r>
     </w:p>
     <w:tbl>
@@ -2248,7 +2572,7 @@
               <w:rPr>
                 <w:sz w:val="20"/>
               </w:rPr>
-              <w:t>Form starts with one empty URL input.</w:t>
+              <w:t>Starts with one empty URL input.</w:t>
             </w:r>
           </w:p>
         </w:tc>
@@ -2304,7 +2628,7 @@
               <w:rPr>
                 <w:sz w:val="20"/>
               </w:rPr>
-              <w:t>Each input (after first) has red "×" button to remove.</w:t>
+              <w:t>Red "x" button to remove each entry.</w:t>
             </w:r>
           </w:p>
         </w:tc>
@@ -2332,7 +2656,7 @@
               <w:rPr>
                 <w:sz w:val="20"/>
               </w:rPr>
-              <w:t>Counter shows "N added" for non-empty URLs.</w:t>
+              <w:t>"N added" counter for non-empty URLs.</w:t>
             </w:r>
           </w:p>
         </w:tc>
@@ -2377,7 +2701,7 @@
         <w:pStyle w:val="Heading1"/>
       </w:pPr>
       <w:r>
-        <w:t>UI 3: Feedback Thread — Comment Tree (/feedback)</w:t>
+        <w:t>UI 3: Interactive Feedback Thread (/feedback)</w:t>
       </w:r>
     </w:p>
     <w:p>
@@ -2396,7 +2720,7 @@
               <a:graphicData uri="http://schemas.openxmlformats.org/drawingml/2006/picture">
                 <pic:pic>
                   <pic:nvPicPr>
-                    <pic:cNvPr id="0" name="06-feedback-thread.png"/>
+                    <pic:cNvPr id="0" name="10-feedback-interactive-form.png"/>
                     <pic:cNvPicPr/>
                   </pic:nvPicPr>
                   <pic:blipFill>
@@ -2429,7 +2753,549 @@
           <w:color w:val="646464"/>
           <w:sz w:val="18"/>
         </w:rPr>
-        <w:t>Figure 6: Feedback Thread with recursive comments, Markdown, and code highlighting</w:t>
+        <w:t>Figure 6: Interactive feedback with Add Comment form, role selector, and Markdown textarea</w:t>
+      </w:r>
+    </w:p>
+    <w:p>
+      <w:pPr>
+        <w:pStyle w:val="Heading2"/>
+      </w:pPr>
+      <w:r>
+        <w:t>Comment Form Rules (New Root Comments)</w:t>
+      </w:r>
+    </w:p>
+    <w:tbl>
+      <w:tblPr>
+        <w:tblStyle w:val="LightGrid-Accent1"/>
+        <w:tblW w:type="auto" w:w="0"/>
+        <w:jc w:val="center"/>
+        <w:tblLook w:firstColumn="1" w:firstRow="1" w:lastColumn="0" w:lastRow="0" w:noHBand="0" w:noVBand="1" w:val="04A0"/>
+      </w:tblPr>
+      <w:tblGrid>
+        <w:gridCol w:w="4320"/>
+        <w:gridCol w:w="4320"/>
+      </w:tblGrid>
+      <w:tr>
+        <w:tc>
+          <w:tcPr>
+            <w:tcW w:type="dxa" w:w="4320"/>
+          </w:tcPr>
+          <w:p>
+            <w:r>
+              <w:rPr>
+                <w:b/>
+                <w:sz w:val="20"/>
+              </w:rPr>
+              <w:t>#</w:t>
+            </w:r>
+          </w:p>
+        </w:tc>
+        <w:tc>
+          <w:tcPr>
+            <w:tcW w:type="dxa" w:w="4320"/>
+          </w:tcPr>
+          <w:p>
+            <w:r>
+              <w:rPr>
+                <w:b/>
+                <w:sz w:val="20"/>
+              </w:rPr>
+              <w:t>Rule</w:t>
+            </w:r>
+          </w:p>
+        </w:tc>
+      </w:tr>
+      <w:tr>
+        <w:tc>
+          <w:tcPr>
+            <w:tcW w:type="dxa" w:w="4320"/>
+          </w:tcPr>
+          <w:p>
+            <w:r>
+              <w:rPr>
+                <w:sz w:val="20"/>
+              </w:rPr>
+              <w:t>CF-1</w:t>
+            </w:r>
+          </w:p>
+        </w:tc>
+        <w:tc>
+          <w:tcPr>
+            <w:tcW w:type="dxa" w:w="4320"/>
+          </w:tcPr>
+          <w:p>
+            <w:r>
+              <w:rPr>
+                <w:sz w:val="20"/>
+              </w:rPr>
+              <w:t>"Add a Comment" form at top: name input, role selector (Student/Mentor/OP), Markdown textarea.</w:t>
+            </w:r>
+          </w:p>
+        </w:tc>
+      </w:tr>
+      <w:tr>
+        <w:tc>
+          <w:tcPr>
+            <w:tcW w:type="dxa" w:w="4320"/>
+          </w:tcPr>
+          <w:p>
+            <w:r>
+              <w:rPr>
+                <w:sz w:val="20"/>
+              </w:rPr>
+              <w:t>CF-2</w:t>
+            </w:r>
+          </w:p>
+        </w:tc>
+        <w:tc>
+          <w:tcPr>
+            <w:tcW w:type="dxa" w:w="4320"/>
+          </w:tcPr>
+          <w:p>
+            <w:r>
+              <w:rPr>
+                <w:sz w:val="20"/>
+              </w:rPr>
+              <w:t>"Post Comment" adds new root-level node to the tree.</w:t>
+            </w:r>
+          </w:p>
+        </w:tc>
+      </w:tr>
+      <w:tr>
+        <w:tc>
+          <w:tcPr>
+            <w:tcW w:type="dxa" w:w="4320"/>
+          </w:tcPr>
+          <w:p>
+            <w:r>
+              <w:rPr>
+                <w:sz w:val="20"/>
+              </w:rPr>
+              <w:t>CF-3</w:t>
+            </w:r>
+          </w:p>
+        </w:tc>
+        <w:tc>
+          <w:tcPr>
+            <w:tcW w:type="dxa" w:w="4320"/>
+          </w:tcPr>
+          <w:p>
+            <w:r>
+              <w:rPr>
+                <w:sz w:val="20"/>
+              </w:rPr>
+              <w:t>Empty comments rejected (button disabled when textarea empty).</w:t>
+            </w:r>
+          </w:p>
+        </w:tc>
+      </w:tr>
+      <w:tr>
+        <w:tc>
+          <w:tcPr>
+            <w:tcW w:type="dxa" w:w="4320"/>
+          </w:tcPr>
+          <w:p>
+            <w:r>
+              <w:rPr>
+                <w:sz w:val="20"/>
+              </w:rPr>
+              <w:t>CF-4</w:t>
+            </w:r>
+          </w:p>
+        </w:tc>
+        <w:tc>
+          <w:tcPr>
+            <w:tcW w:type="dxa" w:w="4320"/>
+          </w:tcPr>
+          <w:p>
+            <w:r>
+              <w:rPr>
+                <w:sz w:val="20"/>
+              </w:rPr>
+              <w:t>"Total comments: N" counter updates in real-time.</w:t>
+            </w:r>
+          </w:p>
+        </w:tc>
+      </w:tr>
+      <w:tr>
+        <w:tc>
+          <w:tcPr>
+            <w:tcW w:type="dxa" w:w="4320"/>
+          </w:tcPr>
+          <w:p>
+            <w:r>
+              <w:rPr>
+                <w:sz w:val="20"/>
+              </w:rPr>
+              <w:t>CF-5</w:t>
+            </w:r>
+          </w:p>
+        </w:tc>
+        <w:tc>
+          <w:tcPr>
+            <w:tcW w:type="dxa" w:w="4320"/>
+          </w:tcPr>
+          <w:p>
+            <w:r>
+              <w:rPr>
+                <w:sz w:val="20"/>
+              </w:rPr>
+              <w:t>Supports Markdown: **bold**, `code`, code blocks.</w:t>
+            </w:r>
+          </w:p>
+        </w:tc>
+      </w:tr>
+      <w:tr>
+        <w:tc>
+          <w:tcPr>
+            <w:tcW w:type="dxa" w:w="4320"/>
+          </w:tcPr>
+          <w:p>
+            <w:r>
+              <w:rPr>
+                <w:sz w:val="20"/>
+              </w:rPr>
+              <w:t>CF-6</w:t>
+            </w:r>
+          </w:p>
+        </w:tc>
+        <w:tc>
+          <w:tcPr>
+            <w:tcW w:type="dxa" w:w="4320"/>
+          </w:tcPr>
+          <w:p>
+            <w:r>
+              <w:rPr>
+                <w:sz w:val="20"/>
+              </w:rPr>
+              <w:t>Role selector determines badge: Student (none), Mentor (amber), OP (blue).</w:t>
+            </w:r>
+          </w:p>
+        </w:tc>
+      </w:tr>
+    </w:tbl>
+    <w:p/>
+    <w:p>
+      <w:pPr>
+        <w:pStyle w:val="Heading2"/>
+      </w:pPr>
+      <w:r>
+        <w:t>Reply Form Rules (Nested Comments)</w:t>
+      </w:r>
+    </w:p>
+    <w:tbl>
+      <w:tblPr>
+        <w:tblStyle w:val="LightGrid-Accent1"/>
+        <w:tblW w:type="auto" w:w="0"/>
+        <w:jc w:val="center"/>
+        <w:tblLook w:firstColumn="1" w:firstRow="1" w:lastColumn="0" w:lastRow="0" w:noHBand="0" w:noVBand="1" w:val="04A0"/>
+      </w:tblPr>
+      <w:tblGrid>
+        <w:gridCol w:w="4320"/>
+        <w:gridCol w:w="4320"/>
+      </w:tblGrid>
+      <w:tr>
+        <w:tc>
+          <w:tcPr>
+            <w:tcW w:type="dxa" w:w="4320"/>
+          </w:tcPr>
+          <w:p>
+            <w:r>
+              <w:rPr>
+                <w:b/>
+                <w:sz w:val="20"/>
+              </w:rPr>
+              <w:t>#</w:t>
+            </w:r>
+          </w:p>
+        </w:tc>
+        <w:tc>
+          <w:tcPr>
+            <w:tcW w:type="dxa" w:w="4320"/>
+          </w:tcPr>
+          <w:p>
+            <w:r>
+              <w:rPr>
+                <w:b/>
+                <w:sz w:val="20"/>
+              </w:rPr>
+              <w:t>Rule</w:t>
+            </w:r>
+          </w:p>
+        </w:tc>
+      </w:tr>
+      <w:tr>
+        <w:tc>
+          <w:tcPr>
+            <w:tcW w:type="dxa" w:w="4320"/>
+          </w:tcPr>
+          <w:p>
+            <w:r>
+              <w:rPr>
+                <w:sz w:val="20"/>
+              </w:rPr>
+              <w:t>RF-1</w:t>
+            </w:r>
+          </w:p>
+        </w:tc>
+        <w:tc>
+          <w:tcPr>
+            <w:tcW w:type="dxa" w:w="4320"/>
+          </w:tcPr>
+          <w:p>
+            <w:r>
+              <w:rPr>
+                <w:sz w:val="20"/>
+              </w:rPr>
+              <w:t>Each comment has "Reply" button alongside Upvote and Mark Accepted.</w:t>
+            </w:r>
+          </w:p>
+        </w:tc>
+      </w:tr>
+      <w:tr>
+        <w:tc>
+          <w:tcPr>
+            <w:tcW w:type="dxa" w:w="4320"/>
+          </w:tcPr>
+          <w:p>
+            <w:r>
+              <w:rPr>
+                <w:sz w:val="20"/>
+              </w:rPr>
+              <w:t>RF-2</w:t>
+            </w:r>
+          </w:p>
+        </w:tc>
+        <w:tc>
+          <w:tcPr>
+            <w:tcW w:type="dxa" w:w="4320"/>
+          </w:tcPr>
+          <w:p>
+            <w:r>
+              <w:rPr>
+                <w:sz w:val="20"/>
+              </w:rPr>
+              <w:t>Clicking Reply opens inline form below the comment.</w:t>
+            </w:r>
+          </w:p>
+        </w:tc>
+      </w:tr>
+      <w:tr>
+        <w:tc>
+          <w:tcPr>
+            <w:tcW w:type="dxa" w:w="4320"/>
+          </w:tcPr>
+          <w:p>
+            <w:r>
+              <w:rPr>
+                <w:sz w:val="20"/>
+              </w:rPr>
+              <w:t>RF-3</w:t>
+            </w:r>
+          </w:p>
+        </w:tc>
+        <w:tc>
+          <w:tcPr>
+            <w:tcW w:type="dxa" w:w="4320"/>
+          </w:tcPr>
+          <w:p>
+            <w:r>
+              <w:rPr>
+                <w:sz w:val="20"/>
+              </w:rPr>
+              <w:t>Reply button text changes to "Cancel" when form is open.</w:t>
+            </w:r>
+          </w:p>
+        </w:tc>
+      </w:tr>
+      <w:tr>
+        <w:tc>
+          <w:tcPr>
+            <w:tcW w:type="dxa" w:w="4320"/>
+          </w:tcPr>
+          <w:p>
+            <w:r>
+              <w:rPr>
+                <w:sz w:val="20"/>
+              </w:rPr>
+              <w:t>RF-4</w:t>
+            </w:r>
+          </w:p>
+        </w:tc>
+        <w:tc>
+          <w:tcPr>
+            <w:tcW w:type="dxa" w:w="4320"/>
+          </w:tcPr>
+          <w:p>
+            <w:r>
+              <w:rPr>
+                <w:sz w:val="20"/>
+              </w:rPr>
+              <w:t>Reply sets parent_id to target comment id -&gt; renders as nested child.</w:t>
+            </w:r>
+          </w:p>
+        </w:tc>
+      </w:tr>
+      <w:tr>
+        <w:tc>
+          <w:tcPr>
+            <w:tcW w:type="dxa" w:w="4320"/>
+          </w:tcPr>
+          <w:p>
+            <w:r>
+              <w:rPr>
+                <w:sz w:val="20"/>
+              </w:rPr>
+              <w:t>RF-5</w:t>
+            </w:r>
+          </w:p>
+        </w:tc>
+        <w:tc>
+          <w:tcPr>
+            <w:tcW w:type="dxa" w:w="4320"/>
+          </w:tcPr>
+          <w:p>
+            <w:r>
+              <w:rPr>
+                <w:sz w:val="20"/>
+              </w:rPr>
+              <w:t>Reply immediately renders with indentation and left border.</w:t>
+            </w:r>
+          </w:p>
+        </w:tc>
+      </w:tr>
+      <w:tr>
+        <w:tc>
+          <w:tcPr>
+            <w:tcW w:type="dxa" w:w="4320"/>
+          </w:tcPr>
+          <w:p>
+            <w:r>
+              <w:rPr>
+                <w:sz w:val="20"/>
+              </w:rPr>
+              <w:t>RF-6</w:t>
+            </w:r>
+          </w:p>
+        </w:tc>
+        <w:tc>
+          <w:tcPr>
+            <w:tcW w:type="dxa" w:w="4320"/>
+          </w:tcPr>
+          <w:p>
+            <w:r>
+              <w:rPr>
+                <w:sz w:val="20"/>
+              </w:rPr>
+              <w:t>After posting, form closes and textarea clears.</w:t>
+            </w:r>
+          </w:p>
+        </w:tc>
+      </w:tr>
+    </w:tbl>
+    <w:p/>
+    <w:p>
+      <w:pPr>
+        <w:jc w:val="center"/>
+      </w:pPr>
+      <w:r>
+        <w:drawing>
+          <wp:inline xmlns:a="http://schemas.openxmlformats.org/drawingml/2006/main" xmlns:pic="http://schemas.openxmlformats.org/drawingml/2006/picture">
+            <wp:extent cx="5029200" cy="2789634"/>
+            <wp:docPr id="7" name="Picture 7"/>
+            <wp:cNvGraphicFramePr>
+              <a:graphicFrameLocks noChangeAspect="1"/>
+            </wp:cNvGraphicFramePr>
+            <a:graphic>
+              <a:graphicData uri="http://schemas.openxmlformats.org/drawingml/2006/picture">
+                <pic:pic>
+                  <pic:nvPicPr>
+                    <pic:cNvPr id="0" name="11-feedback-reply-form.png"/>
+                    <pic:cNvPicPr/>
+                  </pic:nvPicPr>
+                  <pic:blipFill>
+                    <a:blip r:embed="rId15"/>
+                    <a:stretch>
+                      <a:fillRect/>
+                    </a:stretch>
+                  </pic:blipFill>
+                  <pic:spPr>
+                    <a:xfrm>
+                      <a:off x="0" y="0"/>
+                      <a:ext cx="5029200" cy="2789634"/>
+                    </a:xfrm>
+                    <a:prstGeom prst="rect"/>
+                  </pic:spPr>
+                </pic:pic>
+              </a:graphicData>
+            </a:graphic>
+          </wp:inline>
+        </w:drawing>
+      </w:r>
+    </w:p>
+    <w:p>
+      <w:pPr>
+        <w:jc w:val="center"/>
+      </w:pPr>
+      <w:r>
+        <w:rPr>
+          <w:i/>
+          <w:color w:val="646464"/>
+          <w:sz w:val="18"/>
+        </w:rPr>
+        <w:t>Figure 7: Reply form inline below OP comment - "Reply" changed to "Cancel"</w:t>
+      </w:r>
+    </w:p>
+    <w:p>
+      <w:pPr>
+        <w:jc w:val="center"/>
+      </w:pPr>
+      <w:r>
+        <w:drawing>
+          <wp:inline xmlns:a="http://schemas.openxmlformats.org/drawingml/2006/main" xmlns:pic="http://schemas.openxmlformats.org/drawingml/2006/picture">
+            <wp:extent cx="5029200" cy="2789634"/>
+            <wp:docPr id="8" name="Picture 8"/>
+            <wp:cNvGraphicFramePr>
+              <a:graphicFrameLocks noChangeAspect="1"/>
+            </wp:cNvGraphicFramePr>
+            <a:graphic>
+              <a:graphicData uri="http://schemas.openxmlformats.org/drawingml/2006/picture">
+                <pic:pic>
+                  <pic:nvPicPr>
+                    <pic:cNvPr id="0" name="12-feedback-reply-posted.png"/>
+                    <pic:cNvPicPr/>
+                  </pic:nvPicPr>
+                  <pic:blipFill>
+                    <a:blip r:embed="rId16"/>
+                    <a:stretch>
+                      <a:fillRect/>
+                    </a:stretch>
+                  </pic:blipFill>
+                  <pic:spPr>
+                    <a:xfrm>
+                      <a:off x="0" y="0"/>
+                      <a:ext cx="5029200" cy="2789634"/>
+                    </a:xfrm>
+                    <a:prstGeom prst="rect"/>
+                  </pic:spPr>
+                </pic:pic>
+              </a:graphicData>
+            </a:graphic>
+          </wp:inline>
+        </w:drawing>
+      </w:r>
+    </w:p>
+    <w:p>
+      <w:pPr>
+        <w:jc w:val="center"/>
+      </w:pPr>
+      <w:r>
+        <w:rPr>
+          <w:i/>
+          <w:color w:val="646464"/>
+          <w:sz w:val="18"/>
+        </w:rPr>
+        <w:t>Figure 8: Newly posted reply nested under parent</w:t>
       </w:r>
     </w:p>
     <w:p>
@@ -2504,7 +3370,7 @@
               <w:rPr>
                 <w:sz w:val="20"/>
               </w:rPr>
-              <w:t>Comments rendered as recursive tree. Replies indented with left blue border.</w:t>
+              <w:t>Recursive tree rendering with left blue border indentation.</w:t>
             </w:r>
           </w:p>
         </w:tc>
@@ -2532,7 +3398,7 @@
               <w:rPr>
                 <w:sz w:val="20"/>
               </w:rPr>
-              <w:t>Nesting depth is unlimited — replies at increasing indentation.</w:t>
+              <w:t>Unlimited nesting depth.</w:t>
             </w:r>
           </w:p>
         </w:tc>
@@ -2560,7 +3426,7 @@
               <w:rPr>
                 <w:sz w:val="20"/>
               </w:rPr>
-              <w:t>Mentor comments show amber "Mentor" badge.</w:t>
+              <w:t>Mentor: amber "Mentor" badge. OP: blue "OP" badge.</w:t>
             </w:r>
           </w:p>
         </w:tc>
@@ -2588,91 +3454,7 @@
               <w:rPr>
                 <w:sz w:val="20"/>
               </w:rPr>
-              <w:t>OP comments show blue "OP" badge.</w:t>
-            </w:r>
-          </w:p>
-        </w:tc>
-      </w:tr>
-      <w:tr>
-        <w:tc>
-          <w:tcPr>
-            <w:tcW w:type="dxa" w:w="4320"/>
-          </w:tcPr>
-          <w:p>
-            <w:r>
-              <w:rPr>
-                <w:sz w:val="20"/>
-              </w:rPr>
-              <w:t>DR-5</w:t>
-            </w:r>
-          </w:p>
-        </w:tc>
-        <w:tc>
-          <w:tcPr>
-            <w:tcW w:type="dxa" w:w="4320"/>
-          </w:tcPr>
-          <w:p>
-            <w:r>
-              <w:rPr>
-                <w:sz w:val="20"/>
-              </w:rPr>
-              <w:t>Student comments show no badge — only author name.</w:t>
-            </w:r>
-          </w:p>
-        </w:tc>
-      </w:tr>
-      <w:tr>
-        <w:tc>
-          <w:tcPr>
-            <w:tcW w:type="dxa" w:w="4320"/>
-          </w:tcPr>
-          <w:p>
-            <w:r>
-              <w:rPr>
-                <w:sz w:val="20"/>
-              </w:rPr>
-              <w:t>DR-6</w:t>
-            </w:r>
-          </w:p>
-        </w:tc>
-        <w:tc>
-          <w:tcPr>
-            <w:tcW w:type="dxa" w:w="4320"/>
-          </w:tcPr>
-          <w:p>
-            <w:r>
-              <w:rPr>
-                <w:sz w:val="20"/>
-              </w:rPr>
-              <w:t>Comment body supports Markdown: bold, links, inline code, fenced code blocks.</w:t>
-            </w:r>
-          </w:p>
-        </w:tc>
-      </w:tr>
-      <w:tr>
-        <w:tc>
-          <w:tcPr>
-            <w:tcW w:type="dxa" w:w="4320"/>
-          </w:tcPr>
-          <w:p>
-            <w:r>
-              <w:rPr>
-                <w:sz w:val="20"/>
-              </w:rPr>
-              <w:t>DR-7</w:t>
-            </w:r>
-          </w:p>
-        </w:tc>
-        <w:tc>
-          <w:tcPr>
-            <w:tcW w:type="dxa" w:w="4320"/>
-          </w:tcPr>
-          <w:p>
-            <w:r>
-              <w:rPr>
-                <w:sz w:val="20"/>
-              </w:rPr>
-              <w:t>Code blocks render with Prism syntax highlighting (oneLight theme).</w:t>
+              <w:t>Full Markdown support with Prism syntax highlighting.</w:t>
             </w:r>
           </w:p>
         </w:tc>
@@ -2684,7 +3466,7 @@
         <w:pStyle w:val="Heading2"/>
       </w:pPr>
       <w:r>
-        <w:t>Upvote Toggle Rules</w:t>
+        <w:t>Upvote &amp; Accept Rules</w:t>
       </w:r>
     </w:p>
     <w:tbl>
@@ -2751,7 +3533,7 @@
               <w:rPr>
                 <w:sz w:val="20"/>
               </w:rPr>
-              <w:t>Each comment has an "Upvote" button with upward arrow icon.</w:t>
+              <w:t>"Upvote" toggles to "Upvoted" (blue, aria-pressed=true).</w:t>
             </w:r>
           </w:p>
         </w:tc>
@@ -2779,114 +3561,7 @@
               <w:rPr>
                 <w:sz w:val="20"/>
               </w:rPr>
-              <w:t>Click toggles to "Upvoted" — blue fill, white text, aria-pressed=true.</w:t>
-            </w:r>
-          </w:p>
-        </w:tc>
-      </w:tr>
-      <w:tr>
-        <w:tc>
-          <w:tcPr>
-            <w:tcW w:type="dxa" w:w="4320"/>
-          </w:tcPr>
-          <w:p>
-            <w:r>
-              <w:rPr>
-                <w:sz w:val="20"/>
-              </w:rPr>
-              <w:t>UV-3</w:t>
-            </w:r>
-          </w:p>
-        </w:tc>
-        <w:tc>
-          <w:tcPr>
-            <w:tcW w:type="dxa" w:w="4320"/>
-          </w:tcPr>
-          <w:p>
-            <w:r>
-              <w:rPr>
-                <w:sz w:val="20"/>
-              </w:rPr>
-              <w:t>Click again toggles back to default "Upvote" state.</w:t>
-            </w:r>
-          </w:p>
-        </w:tc>
-      </w:tr>
-      <w:tr>
-        <w:tc>
-          <w:tcPr>
-            <w:tcW w:type="dxa" w:w="4320"/>
-          </w:tcPr>
-          <w:p>
-            <w:r>
-              <w:rPr>
-                <w:sz w:val="20"/>
-              </w:rPr>
-              <w:t>UV-4</w:t>
-            </w:r>
-          </w:p>
-        </w:tc>
-        <w:tc>
-          <w:tcPr>
-            <w:tcW w:type="dxa" w:w="4320"/>
-          </w:tcPr>
-          <w:p>
-            <w:r>
-              <w:rPr>
-                <w:sz w:val="20"/>
-              </w:rPr>
-              <w:t>Upvote state is per-comment, independent, client-side (useState).</w:t>
-            </w:r>
-          </w:p>
-        </w:tc>
-      </w:tr>
-    </w:tbl>
-    <w:p/>
-    <w:p>
-      <w:pPr>
-        <w:pStyle w:val="Heading2"/>
-      </w:pPr>
-      <w:r>
-        <w:t>Accept Solution Toggle (OP Only)</w:t>
-      </w:r>
-    </w:p>
-    <w:tbl>
-      <w:tblPr>
-        <w:tblStyle w:val="LightGrid-Accent1"/>
-        <w:tblW w:type="auto" w:w="0"/>
-        <w:jc w:val="center"/>
-        <w:tblLook w:firstColumn="1" w:firstRow="1" w:lastColumn="0" w:lastRow="0" w:noHBand="0" w:noVBand="1" w:val="04A0"/>
-      </w:tblPr>
-      <w:tblGrid>
-        <w:gridCol w:w="4320"/>
-        <w:gridCol w:w="4320"/>
-      </w:tblGrid>
-      <w:tr>
-        <w:tc>
-          <w:tcPr>
-            <w:tcW w:type="dxa" w:w="4320"/>
-          </w:tcPr>
-          <w:p>
-            <w:r>
-              <w:rPr>
-                <w:b/>
-                <w:sz w:val="20"/>
-              </w:rPr>
-              <w:t>#</w:t>
-            </w:r>
-          </w:p>
-        </w:tc>
-        <w:tc>
-          <w:tcPr>
-            <w:tcW w:type="dxa" w:w="4320"/>
-          </w:tcPr>
-          <w:p>
-            <w:r>
-              <w:rPr>
-                <w:b/>
-                <w:sz w:val="20"/>
-              </w:rPr>
-              <w:t>Rule</w:t>
+              <w:t>Per-comment, independent, client-side (useState).</w:t>
             </w:r>
           </w:p>
         </w:tc>
@@ -2914,7 +3589,7 @@
               <w:rPr>
                 <w:sz w:val="20"/>
               </w:rPr>
-              <w:t>"Mark Accepted" button appears only when isOP={true}.</w:t>
+              <w:t>"Mark Accepted" only when isOP={true}. Toggles green.</w:t>
             </w:r>
           </w:p>
         </w:tc>
@@ -2942,63 +3617,7 @@
               <w:rPr>
                 <w:sz w:val="20"/>
               </w:rPr>
-              <w:t>Click toggles to "Accepted" — green fill, aria-pressed=true.</w:t>
-            </w:r>
-          </w:p>
-        </w:tc>
-      </w:tr>
-      <w:tr>
-        <w:tc>
-          <w:tcPr>
-            <w:tcW w:type="dxa" w:w="4320"/>
-          </w:tcPr>
-          <w:p>
-            <w:r>
-              <w:rPr>
-                <w:sz w:val="20"/>
-              </w:rPr>
-              <w:t>AS-3</w:t>
-            </w:r>
-          </w:p>
-        </w:tc>
-        <w:tc>
-          <w:tcPr>
-            <w:tcW w:type="dxa" w:w="4320"/>
-          </w:tcPr>
-          <w:p>
-            <w:r>
-              <w:rPr>
-                <w:sz w:val="20"/>
-              </w:rPr>
-              <w:t>Click again toggles back. Upvote and Accept are independent.</w:t>
-            </w:r>
-          </w:p>
-        </w:tc>
-      </w:tr>
-      <w:tr>
-        <w:tc>
-          <w:tcPr>
-            <w:tcW w:type="dxa" w:w="4320"/>
-          </w:tcPr>
-          <w:p>
-            <w:r>
-              <w:rPr>
-                <w:sz w:val="20"/>
-              </w:rPr>
-              <w:t>AS-4</w:t>
-            </w:r>
-          </w:p>
-        </w:tc>
-        <w:tc>
-          <w:tcPr>
-            <w:tcW w:type="dxa" w:w="4320"/>
-          </w:tcPr>
-          <w:p>
-            <w:r>
-              <w:rPr>
-                <w:sz w:val="20"/>
-              </w:rPr>
-              <w:t>Both can be active simultaneously on the same comment.</w:t>
+              <w:t>Upvote and Accept are independent - both can be active.</w:t>
             </w:r>
           </w:p>
         </w:tc>
@@ -3013,7 +3632,7 @@
         <w:drawing>
           <wp:inline xmlns:a="http://schemas.openxmlformats.org/drawingml/2006/main" xmlns:pic="http://schemas.openxmlformats.org/drawingml/2006/picture">
             <wp:extent cx="5029200" cy="2789634"/>
-            <wp:docPr id="7" name="Picture 7"/>
+            <wp:docPr id="9" name="Picture 9"/>
             <wp:cNvGraphicFramePr>
               <a:graphicFrameLocks noChangeAspect="1"/>
             </wp:cNvGraphicFramePr>
@@ -3025,7 +3644,7 @@
                     <pic:cNvPicPr/>
                   </pic:nvPicPr>
                   <pic:blipFill>
-                    <a:blip r:embed="rId15"/>
+                    <a:blip r:embed="rId17"/>
                     <a:stretch>
                       <a:fillRect/>
                     </a:stretch>
@@ -3054,7 +3673,7 @@
           <w:color w:val="646464"/>
           <w:sz w:val="18"/>
         </w:rPr>
-        <w:t>Figure 7: "Upvoted" (blue) and "Accepted" (green) active simultaneously</w:t>
+        <w:t>Figure 9: "Upvoted" (blue) and "Accepted" (green) simultaneously</w:t>
       </w:r>
     </w:p>
     <w:p>
@@ -3129,7 +3748,7 @@
               <w:rPr>
                 <w:sz w:val="20"/>
               </w:rPr>
-              <w:t>buildCommentTree() converts flat array to nested tree — O(n) two-pass algorithm.</w:t>
+              <w:t>buildCommentTree(): two-pass O(n) algorithm with Map.</w:t>
             </w:r>
           </w:p>
         </w:tc>
@@ -3157,7 +3776,7 @@
               <w:rPr>
                 <w:sz w:val="20"/>
               </w:rPr>
-              <w:t>Pass 1: Index each comment in Map&lt;id, CommentNode&gt; with empty children array.</w:t>
+              <w:t>Pass 1: Index. Pass 2: Link children via parent_id.</w:t>
             </w:r>
           </w:p>
         </w:tc>
@@ -3185,7 +3804,7 @@
               <w:rPr>
                 <w:sz w:val="20"/>
               </w:rPr>
-              <w:t>Pass 2: Link — if parent_id matches, push into parent's children. Else root node.</w:t>
+              <w:t>Orphan comments promoted to root level.</w:t>
             </w:r>
           </w:p>
         </w:tc>
@@ -3213,7 +3832,7 @@
               <w:rPr>
                 <w:sz w:val="20"/>
               </w:rPr>
-              <w:t>Orphan comments (parent_id not found) promoted to root level.</w:t>
+              <w:t>New comments -&gt; flat array -&gt; tree rebuilds -&gt; React re-renders.</w:t>
             </w:r>
           </w:p>
         </w:tc>
@@ -3221,18 +3840,168 @@
     </w:tbl>
     <w:p/>
     <w:p>
+      <w:pPr>
+        <w:pStyle w:val="Heading2"/>
+      </w:pPr>
       <w:r>
-        <w:br w:type="page"/>
+        <w:t>State Management Rules</w:t>
       </w:r>
     </w:p>
-    <w:p>
-      <w:pPr>
-        <w:pStyle w:val="Heading1"/>
-      </w:pPr>
-      <w:r>
-        <w:t>UI 4: Guidance Thread (/guidance/[projectId])</w:t>
-      </w:r>
-    </w:p>
+    <w:tbl>
+      <w:tblPr>
+        <w:tblStyle w:val="LightGrid-Accent1"/>
+        <w:tblW w:type="auto" w:w="0"/>
+        <w:jc w:val="center"/>
+        <w:tblLook w:firstColumn="1" w:firstRow="1" w:lastColumn="0" w:lastRow="0" w:noHBand="0" w:noVBand="1" w:val="04A0"/>
+      </w:tblPr>
+      <w:tblGrid>
+        <w:gridCol w:w="4320"/>
+        <w:gridCol w:w="4320"/>
+      </w:tblGrid>
+      <w:tr>
+        <w:tc>
+          <w:tcPr>
+            <w:tcW w:type="dxa" w:w="4320"/>
+          </w:tcPr>
+          <w:p>
+            <w:r>
+              <w:rPr>
+                <w:b/>
+                <w:sz w:val="20"/>
+              </w:rPr>
+              <w:t>#</w:t>
+            </w:r>
+          </w:p>
+        </w:tc>
+        <w:tc>
+          <w:tcPr>
+            <w:tcW w:type="dxa" w:w="4320"/>
+          </w:tcPr>
+          <w:p>
+            <w:r>
+              <w:rPr>
+                <w:b/>
+                <w:sz w:val="20"/>
+              </w:rPr>
+              <w:t>Rule</w:t>
+            </w:r>
+          </w:p>
+        </w:tc>
+      </w:tr>
+      <w:tr>
+        <w:tc>
+          <w:tcPr>
+            <w:tcW w:type="dxa" w:w="4320"/>
+          </w:tcPr>
+          <w:p>
+            <w:r>
+              <w:rPr>
+                <w:sz w:val="20"/>
+              </w:rPr>
+              <w:t>SM-1</w:t>
+            </w:r>
+          </w:p>
+        </w:tc>
+        <w:tc>
+          <w:tcPr>
+            <w:tcW w:type="dxa" w:w="4320"/>
+          </w:tcPr>
+          <w:p>
+            <w:r>
+              <w:rPr>
+                <w:sz w:val="20"/>
+              </w:rPr>
+              <w:t>All comments in React useState&lt;Comment[]&gt; (client-side).</w:t>
+            </w:r>
+          </w:p>
+        </w:tc>
+      </w:tr>
+      <w:tr>
+        <w:tc>
+          <w:tcPr>
+            <w:tcW w:type="dxa" w:w="4320"/>
+          </w:tcPr>
+          <w:p>
+            <w:r>
+              <w:rPr>
+                <w:sz w:val="20"/>
+              </w:rPr>
+              <w:t>SM-2</w:t>
+            </w:r>
+          </w:p>
+        </w:tc>
+        <w:tc>
+          <w:tcPr>
+            <w:tcW w:type="dxa" w:w="4320"/>
+          </w:tcPr>
+          <w:p>
+            <w:r>
+              <w:rPr>
+                <w:sz w:val="20"/>
+              </w:rPr>
+              <w:t>New comment appends to flat array with unique generated id.</w:t>
+            </w:r>
+          </w:p>
+        </w:tc>
+      </w:tr>
+      <w:tr>
+        <w:tc>
+          <w:tcPr>
+            <w:tcW w:type="dxa" w:w="4320"/>
+          </w:tcPr>
+          <w:p>
+            <w:r>
+              <w:rPr>
+                <w:sz w:val="20"/>
+              </w:rPr>
+              <w:t>SM-3</w:t>
+            </w:r>
+          </w:p>
+        </w:tc>
+        <w:tc>
+          <w:tcPr>
+            <w:tcW w:type="dxa" w:w="4320"/>
+          </w:tcPr>
+          <w:p>
+            <w:r>
+              <w:rPr>
+                <w:sz w:val="20"/>
+              </w:rPr>
+              <w:t>buildCommentTree() called each render to rebuild tree.</w:t>
+            </w:r>
+          </w:p>
+        </w:tc>
+      </w:tr>
+      <w:tr>
+        <w:tc>
+          <w:tcPr>
+            <w:tcW w:type="dxa" w:w="4320"/>
+          </w:tcPr>
+          <w:p>
+            <w:r>
+              <w:rPr>
+                <w:sz w:val="20"/>
+              </w:rPr>
+              <w:t>SM-4</w:t>
+            </w:r>
+          </w:p>
+        </w:tc>
+        <w:tc>
+          <w:tcPr>
+            <w:tcW w:type="dxa" w:w="4320"/>
+          </w:tcPr>
+          <w:p>
+            <w:r>
+              <w:rPr>
+                <w:sz w:val="20"/>
+              </w:rPr>
+              <w:t>Upvote/accept reset on page reload (client-side state).</w:t>
+            </w:r>
+          </w:p>
+        </w:tc>
+      </w:tr>
+    </w:tbl>
+    <w:p/>
     <w:p>
       <w:pPr>
         <w:jc w:val="center"/>
@@ -3241,7 +4010,7 @@
         <w:drawing>
           <wp:inline xmlns:a="http://schemas.openxmlformats.org/drawingml/2006/main" xmlns:pic="http://schemas.openxmlformats.org/drawingml/2006/picture">
             <wp:extent cx="5029200" cy="2789634"/>
-            <wp:docPr id="8" name="Picture 8"/>
+            <wp:docPr id="10" name="Picture 10"/>
             <wp:cNvGraphicFramePr>
               <a:graphicFrameLocks noChangeAspect="1"/>
             </wp:cNvGraphicFramePr>
@@ -3249,11 +4018,11 @@
               <a:graphicData uri="http://schemas.openxmlformats.org/drawingml/2006/picture">
                 <pic:pic>
                   <pic:nvPicPr>
-                    <pic:cNvPr id="0" name="08-guidance-thread.png"/>
+                    <pic:cNvPr id="0" name="13-feedback-new-comment.png"/>
                     <pic:cNvPicPr/>
                   </pic:nvPicPr>
                   <pic:blipFill>
-                    <a:blip r:embed="rId16"/>
+                    <a:blip r:embed="rId18"/>
                     <a:stretch>
                       <a:fillRect/>
                     </a:stretch>
@@ -3282,7 +4051,72 @@
           <w:color w:val="646464"/>
           <w:sz w:val="18"/>
         </w:rPr>
-        <w:t>Figure 8: Guidance Thread — mentor comments, student replies, code blocks, date stamps</w:t>
+        <w:t>Figure 10: Newly posted mentor comment at bottom of thread</w:t>
+      </w:r>
+    </w:p>
+    <w:p>
+      <w:r>
+        <w:br w:type="page"/>
+      </w:r>
+    </w:p>
+    <w:p>
+      <w:pPr>
+        <w:pStyle w:val="Heading1"/>
+      </w:pPr>
+      <w:r>
+        <w:t>UI 4: Interactive Guidance Thread (/guidance/[projectId])</w:t>
+      </w:r>
+    </w:p>
+    <w:p>
+      <w:pPr>
+        <w:jc w:val="center"/>
+      </w:pPr>
+      <w:r>
+        <w:drawing>
+          <wp:inline xmlns:a="http://schemas.openxmlformats.org/drawingml/2006/main" xmlns:pic="http://schemas.openxmlformats.org/drawingml/2006/picture">
+            <wp:extent cx="5029200" cy="2789634"/>
+            <wp:docPr id="11" name="Picture 11"/>
+            <wp:cNvGraphicFramePr>
+              <a:graphicFrameLocks noChangeAspect="1"/>
+            </wp:cNvGraphicFramePr>
+            <a:graphic>
+              <a:graphicData uri="http://schemas.openxmlformats.org/drawingml/2006/picture">
+                <pic:pic>
+                  <pic:nvPicPr>
+                    <pic:cNvPr id="0" name="14-guidance-interactive.png"/>
+                    <pic:cNvPicPr/>
+                  </pic:nvPicPr>
+                  <pic:blipFill>
+                    <a:blip r:embed="rId19"/>
+                    <a:stretch>
+                      <a:fillRect/>
+                    </a:stretch>
+                  </pic:blipFill>
+                  <pic:spPr>
+                    <a:xfrm>
+                      <a:off x="0" y="0"/>
+                      <a:ext cx="5029200" cy="2789634"/>
+                    </a:xfrm>
+                    <a:prstGeom prst="rect"/>
+                  </pic:spPr>
+                </pic:pic>
+              </a:graphicData>
+            </a:graphic>
+          </wp:inline>
+        </w:drawing>
+      </w:r>
+    </w:p>
+    <w:p>
+      <w:pPr>
+        <w:jc w:val="center"/>
+      </w:pPr>
+      <w:r>
+        <w:rPr>
+          <w:i/>
+          <w:color w:val="646464"/>
+          <w:sz w:val="18"/>
+        </w:rPr>
+        <w:t>Figure 11: Interactive guidance with comment form, mentor badges, dates, code blocks</w:t>
       </w:r>
     </w:p>
     <w:p>
@@ -3357,7 +4191,7 @@
               <w:rPr>
                 <w:sz w:val="20"/>
               </w:rPr>
-              <w:t>Heading: "Guidance Thread" with projectId in &lt;code&gt; tag.</w:t>
+              <w:t>"Guidance Thread" heading with projectId in &lt;code&gt; tag.</w:t>
             </w:r>
           </w:p>
         </w:tc>
@@ -3385,7 +4219,7 @@
               <w:rPr>
                 <w:sz w:val="20"/>
               </w:rPr>
-              <w:t>Dynamic route — /guidance/[projectId] accepts any project ID.</w:t>
+              <w:t>Dynamic route: /guidance/[projectId] accepts any project ID.</w:t>
             </w:r>
           </w:p>
         </w:tc>
@@ -3413,7 +4247,7 @@
               <w:rPr>
                 <w:sz w:val="20"/>
               </w:rPr>
-              <w:t>Comments show created_at date stamps on the right side.</w:t>
+              <w:t>Comments show created_at date stamps on the right.</w:t>
             </w:r>
           </w:p>
         </w:tc>
@@ -3441,7 +4275,58 @@
               <w:rPr>
                 <w:sz w:val="20"/>
               </w:rPr>
-              <w:t>Thread structure identical to Feedback — recursive nesting, role badges, Markdown.</w:t>
+              <w:t>Mentor badge (amber), OP badge (blue), syntax-highlighted code.</w:t>
+            </w:r>
+          </w:p>
+        </w:tc>
+      </w:tr>
+    </w:tbl>
+    <w:p/>
+    <w:p>
+      <w:pPr>
+        <w:pStyle w:val="Heading2"/>
+      </w:pPr>
+      <w:r>
+        <w:t>Comment Form Rules</w:t>
+      </w:r>
+    </w:p>
+    <w:tbl>
+      <w:tblPr>
+        <w:tblStyle w:val="LightGrid-Accent1"/>
+        <w:tblW w:type="auto" w:w="0"/>
+        <w:jc w:val="center"/>
+        <w:tblLook w:firstColumn="1" w:firstRow="1" w:lastColumn="0" w:lastRow="0" w:noHBand="0" w:noVBand="1" w:val="04A0"/>
+      </w:tblPr>
+      <w:tblGrid>
+        <w:gridCol w:w="4320"/>
+        <w:gridCol w:w="4320"/>
+      </w:tblGrid>
+      <w:tr>
+        <w:tc>
+          <w:tcPr>
+            <w:tcW w:type="dxa" w:w="4320"/>
+          </w:tcPr>
+          <w:p>
+            <w:r>
+              <w:rPr>
+                <w:b/>
+                <w:sz w:val="20"/>
+              </w:rPr>
+              <w:t>#</w:t>
+            </w:r>
+          </w:p>
+        </w:tc>
+        <w:tc>
+          <w:tcPr>
+            <w:tcW w:type="dxa" w:w="4320"/>
+          </w:tcPr>
+          <w:p>
+            <w:r>
+              <w:rPr>
+                <w:b/>
+                <w:sz w:val="20"/>
+              </w:rPr>
+              <w:t>Rule</w:t>
             </w:r>
           </w:p>
         </w:tc>
@@ -3456,7 +4341,7 @@
               <w:rPr>
                 <w:sz w:val="20"/>
               </w:rPr>
-              <w:t>DR-12</w:t>
+              <w:t>GF-1</w:t>
             </w:r>
           </w:p>
         </w:tc>
@@ -3469,7 +4354,7 @@
               <w:rPr>
                 <w:sz w:val="20"/>
               </w:rPr>
-              <w:t>Mentor comments: amber "Mentor" badge + author + date.</w:t>
+              <w:t>"Add Guidance Comment" form: name input, role selector, Markdown textarea.</w:t>
             </w:r>
           </w:p>
         </w:tc>
@@ -3484,7 +4369,7 @@
               <w:rPr>
                 <w:sz w:val="20"/>
               </w:rPr>
-              <w:t>DR-13</w:t>
+              <w:t>GF-2</w:t>
             </w:r>
           </w:p>
         </w:tc>
@@ -3497,13 +4382,228 @@
               <w:rPr>
                 <w:sz w:val="20"/>
               </w:rPr>
-              <w:t>OP comments: blue "OP" badge + author + date.</w:t>
+              <w:t>Posts root comments with auto-generated id, project_id, created_at.</w:t>
+            </w:r>
+          </w:p>
+        </w:tc>
+      </w:tr>
+      <w:tr>
+        <w:tc>
+          <w:tcPr>
+            <w:tcW w:type="dxa" w:w="4320"/>
+          </w:tcPr>
+          <w:p>
+            <w:r>
+              <w:rPr>
+                <w:sz w:val="20"/>
+              </w:rPr>
+              <w:t>GF-3</w:t>
+            </w:r>
+          </w:p>
+        </w:tc>
+        <w:tc>
+          <w:tcPr>
+            <w:tcW w:type="dxa" w:w="4320"/>
+          </w:tcPr>
+          <w:p>
+            <w:r>
+              <w:rPr>
+                <w:sz w:val="20"/>
+              </w:rPr>
+              <w:t>Total comments counter updates in real-time.</w:t>
             </w:r>
           </w:p>
         </w:tc>
       </w:tr>
     </w:tbl>
     <w:p/>
+    <w:p>
+      <w:pPr>
+        <w:pStyle w:val="Heading2"/>
+      </w:pPr>
+      <w:r>
+        <w:t>Reply Form Rules</w:t>
+      </w:r>
+    </w:p>
+    <w:tbl>
+      <w:tblPr>
+        <w:tblStyle w:val="LightGrid-Accent1"/>
+        <w:tblW w:type="auto" w:w="0"/>
+        <w:jc w:val="center"/>
+        <w:tblLook w:firstColumn="1" w:firstRow="1" w:lastColumn="0" w:lastRow="0" w:noHBand="0" w:noVBand="1" w:val="04A0"/>
+      </w:tblPr>
+      <w:tblGrid>
+        <w:gridCol w:w="4320"/>
+        <w:gridCol w:w="4320"/>
+      </w:tblGrid>
+      <w:tr>
+        <w:tc>
+          <w:tcPr>
+            <w:tcW w:type="dxa" w:w="4320"/>
+          </w:tcPr>
+          <w:p>
+            <w:r>
+              <w:rPr>
+                <w:b/>
+                <w:sz w:val="20"/>
+              </w:rPr>
+              <w:t>#</w:t>
+            </w:r>
+          </w:p>
+        </w:tc>
+        <w:tc>
+          <w:tcPr>
+            <w:tcW w:type="dxa" w:w="4320"/>
+          </w:tcPr>
+          <w:p>
+            <w:r>
+              <w:rPr>
+                <w:b/>
+                <w:sz w:val="20"/>
+              </w:rPr>
+              <w:t>Rule</w:t>
+            </w:r>
+          </w:p>
+        </w:tc>
+      </w:tr>
+      <w:tr>
+        <w:tc>
+          <w:tcPr>
+            <w:tcW w:type="dxa" w:w="4320"/>
+          </w:tcPr>
+          <w:p>
+            <w:r>
+              <w:rPr>
+                <w:sz w:val="20"/>
+              </w:rPr>
+              <w:t>GR-1</w:t>
+            </w:r>
+          </w:p>
+        </w:tc>
+        <w:tc>
+          <w:tcPr>
+            <w:tcW w:type="dxa" w:w="4320"/>
+          </w:tcPr>
+          <w:p>
+            <w:r>
+              <w:rPr>
+                <w:sz w:val="20"/>
+              </w:rPr>
+              <w:t>"Reply" button opens inline form. Replies nest via parent_id.</w:t>
+            </w:r>
+          </w:p>
+        </w:tc>
+      </w:tr>
+      <w:tr>
+        <w:tc>
+          <w:tcPr>
+            <w:tcW w:type="dxa" w:w="4320"/>
+          </w:tcPr>
+          <w:p>
+            <w:r>
+              <w:rPr>
+                <w:sz w:val="20"/>
+              </w:rPr>
+              <w:t>GR-2</w:t>
+            </w:r>
+          </w:p>
+        </w:tc>
+        <w:tc>
+          <w:tcPr>
+            <w:tcW w:type="dxa" w:w="4320"/>
+          </w:tcPr>
+          <w:p>
+            <w:r>
+              <w:rPr>
+                <w:sz w:val="20"/>
+              </w:rPr>
+              <w:t>Same interaction pattern as feedback thread.</w:t>
+            </w:r>
+          </w:p>
+        </w:tc>
+      </w:tr>
+      <w:tr>
+        <w:tc>
+          <w:tcPr>
+            <w:tcW w:type="dxa" w:w="4320"/>
+          </w:tcPr>
+          <w:p>
+            <w:r>
+              <w:rPr>
+                <w:sz w:val="20"/>
+              </w:rPr>
+              <w:t>GR-3</w:t>
+            </w:r>
+          </w:p>
+        </w:tc>
+        <w:tc>
+          <w:tcPr>
+            <w:tcW w:type="dxa" w:w="4320"/>
+          </w:tcPr>
+          <w:p>
+            <w:r>
+              <w:rPr>
+                <w:sz w:val="20"/>
+              </w:rPr>
+              <w:t>Reply form includes name, role selector, Markdown textarea.</w:t>
+            </w:r>
+          </w:p>
+        </w:tc>
+      </w:tr>
+    </w:tbl>
+    <w:p/>
+    <w:p>
+      <w:pPr>
+        <w:jc w:val="center"/>
+      </w:pPr>
+      <w:r>
+        <w:drawing>
+          <wp:inline xmlns:a="http://schemas.openxmlformats.org/drawingml/2006/main" xmlns:pic="http://schemas.openxmlformats.org/drawingml/2006/picture">
+            <wp:extent cx="5029200" cy="2789634"/>
+            <wp:docPr id="12" name="Picture 12"/>
+            <wp:cNvGraphicFramePr>
+              <a:graphicFrameLocks noChangeAspect="1"/>
+            </wp:cNvGraphicFramePr>
+            <a:graphic>
+              <a:graphicData uri="http://schemas.openxmlformats.org/drawingml/2006/picture">
+                <pic:pic>
+                  <pic:nvPicPr>
+                    <pic:cNvPr id="0" name="15-guidance-reply-form.png"/>
+                    <pic:cNvPicPr/>
+                  </pic:nvPicPr>
+                  <pic:blipFill>
+                    <a:blip r:embed="rId20"/>
+                    <a:stretch>
+                      <a:fillRect/>
+                    </a:stretch>
+                  </pic:blipFill>
+                  <pic:spPr>
+                    <a:xfrm>
+                      <a:off x="0" y="0"/>
+                      <a:ext cx="5029200" cy="2789634"/>
+                    </a:xfrm>
+                    <a:prstGeom prst="rect"/>
+                  </pic:spPr>
+                </pic:pic>
+              </a:graphicData>
+            </a:graphic>
+          </wp:inline>
+        </w:drawing>
+      </w:r>
+    </w:p>
+    <w:p>
+      <w:pPr>
+        <w:jc w:val="center"/>
+      </w:pPr>
+      <w:r>
+        <w:rPr>
+          <w:i/>
+          <w:color w:val="646464"/>
+          <w:sz w:val="18"/>
+        </w:rPr>
+        <w:t>Figure 12: Reply form on Dr. Fernando mentor comment - "Reply" changed to "Cancel"</w:t>
+      </w:r>
+    </w:p>
     <w:p>
       <w:pPr>
         <w:pStyle w:val="Heading2"/>
@@ -3576,7 +4676,7 @@
               <w:rPr>
                 <w:sz w:val="20"/>
               </w:rPr>
-              <w:t>Comments fetched server-side via fetchCommentsByProjectId() — async Server Component.</w:t>
+              <w:t>Initial comments fetched server-side (async Server Component).</w:t>
             </w:r>
           </w:p>
         </w:tc>
@@ -3604,7 +4704,7 @@
               <w:rPr>
                 <w:sz w:val="20"/>
               </w:rPr>
-              <w:t>Empty state: "No guidance comments yet — be the first to reply!"</w:t>
+              <w:t>Empty state: "No guidance comments yet."</w:t>
             </w:r>
           </w:p>
         </w:tc>
@@ -3632,172 +4732,13 @@
               <w:rPr>
                 <w:sz w:val="20"/>
               </w:rPr>
-              <w:t>Comments transformed into nested tree using same buildCommentTree() algorithm.</w:t>
+              <w:t>Same buildCommentTree() O(n) algorithm as feedback thread.</w:t>
             </w:r>
           </w:p>
         </w:tc>
       </w:tr>
     </w:tbl>
     <w:p/>
-    <w:p>
-      <w:pPr>
-        <w:pStyle w:val="Heading2"/>
-      </w:pPr>
-      <w:r>
-        <w:t>Interaction Rules</w:t>
-      </w:r>
-    </w:p>
-    <w:tbl>
-      <w:tblPr>
-        <w:tblStyle w:val="LightGrid-Accent1"/>
-        <w:tblW w:type="auto" w:w="0"/>
-        <w:jc w:val="center"/>
-        <w:tblLook w:firstColumn="1" w:firstRow="1" w:lastColumn="0" w:lastRow="0" w:noHBand="0" w:noVBand="1" w:val="04A0"/>
-      </w:tblPr>
-      <w:tblGrid>
-        <w:gridCol w:w="4320"/>
-        <w:gridCol w:w="4320"/>
-      </w:tblGrid>
-      <w:tr>
-        <w:tc>
-          <w:tcPr>
-            <w:tcW w:type="dxa" w:w="4320"/>
-          </w:tcPr>
-          <w:p>
-            <w:r>
-              <w:rPr>
-                <w:b/>
-                <w:sz w:val="20"/>
-              </w:rPr>
-              <w:t>#</w:t>
-            </w:r>
-          </w:p>
-        </w:tc>
-        <w:tc>
-          <w:tcPr>
-            <w:tcW w:type="dxa" w:w="4320"/>
-          </w:tcPr>
-          <w:p>
-            <w:r>
-              <w:rPr>
-                <w:b/>
-                <w:sz w:val="20"/>
-              </w:rPr>
-              <w:t>Rule</w:t>
-            </w:r>
-          </w:p>
-        </w:tc>
-      </w:tr>
-      <w:tr>
-        <w:tc>
-          <w:tcPr>
-            <w:tcW w:type="dxa" w:w="4320"/>
-          </w:tcPr>
-          <w:p>
-            <w:r>
-              <w:rPr>
-                <w:sz w:val="20"/>
-              </w:rPr>
-              <w:t>GI-1</w:t>
-            </w:r>
-          </w:p>
-        </w:tc>
-        <w:tc>
-          <w:tcPr>
-            <w:tcW w:type="dxa" w:w="4320"/>
-          </w:tcPr>
-          <w:p>
-            <w:r>
-              <w:rPr>
-                <w:sz w:val="20"/>
-              </w:rPr>
-              <w:t>Upvote and Mark Accepted buttons identical to Feedback Thread.</w:t>
-            </w:r>
-          </w:p>
-        </w:tc>
-      </w:tr>
-      <w:tr>
-        <w:tc>
-          <w:tcPr>
-            <w:tcW w:type="dxa" w:w="4320"/>
-          </w:tcPr>
-          <w:p>
-            <w:r>
-              <w:rPr>
-                <w:sz w:val="20"/>
-              </w:rPr>
-              <w:t>GI-2</w:t>
-            </w:r>
-          </w:p>
-        </w:tc>
-        <w:tc>
-          <w:tcPr>
-            <w:tcW w:type="dxa" w:w="4320"/>
-          </w:tcPr>
-          <w:p>
-            <w:r>
-              <w:rPr>
-                <w:sz w:val="20"/>
-              </w:rPr>
-              <w:t>Mentor code suggestions render with syntax highlighting.</w:t>
-            </w:r>
-          </w:p>
-        </w:tc>
-      </w:tr>
-    </w:tbl>
-    <w:p/>
-    <w:p>
-      <w:pPr>
-        <w:jc w:val="center"/>
-      </w:pPr>
-      <w:r>
-        <w:drawing>
-          <wp:inline xmlns:a="http://schemas.openxmlformats.org/drawingml/2006/main" xmlns:pic="http://schemas.openxmlformats.org/drawingml/2006/picture">
-            <wp:extent cx="5029200" cy="2789634"/>
-            <wp:docPr id="9" name="Picture 9"/>
-            <wp:cNvGraphicFramePr>
-              <a:graphicFrameLocks noChangeAspect="1"/>
-            </wp:cNvGraphicFramePr>
-            <a:graphic>
-              <a:graphicData uri="http://schemas.openxmlformats.org/drawingml/2006/picture">
-                <pic:pic>
-                  <pic:nvPicPr>
-                    <pic:cNvPr id="0" name="09-guidance-interactions.png"/>
-                    <pic:cNvPicPr/>
-                  </pic:nvPicPr>
-                  <pic:blipFill>
-                    <a:blip r:embed="rId17"/>
-                    <a:stretch>
-                      <a:fillRect/>
-                    </a:stretch>
-                  </pic:blipFill>
-                  <pic:spPr>
-                    <a:xfrm>
-                      <a:off x="0" y="0"/>
-                      <a:ext cx="5029200" cy="2789634"/>
-                    </a:xfrm>
-                    <a:prstGeom prst="rect"/>
-                  </pic:spPr>
-                </pic:pic>
-              </a:graphicData>
-            </a:graphic>
-          </wp:inline>
-        </w:drawing>
-      </w:r>
-    </w:p>
-    <w:p>
-      <w:pPr>
-        <w:jc w:val="center"/>
-      </w:pPr>
-      <w:r>
-        <w:rPr>
-          <w:i/>
-          <w:color w:val="646464"/>
-          <w:sz w:val="18"/>
-        </w:rPr>
-        <w:t>Figure 9: Guidance comment "Upvoted" and "Accepted" with code block</w:t>
-      </w:r>
-    </w:p>
     <w:p>
       <w:r>
         <w:br w:type="page"/>
@@ -3903,7 +4844,7 @@
               <w:rPr>
                 <w:sz w:val="20"/>
               </w:rPr>
-              <w:t>UI component library</w:t>
+              <w:t>UI library with useState, useCallback hooks</w:t>
             </w:r>
           </w:p>
         </w:tc>
@@ -4071,7 +5012,7 @@
               <w:rPr>
                 <w:sz w:val="20"/>
               </w:rPr>
-              <w:t>Code block syntax highlighting</w:t>
+              <w:t>Code block syntax highlighting (Prism)</w:t>
             </w:r>
           </w:p>
         </w:tc>
@@ -4206,7 +5147,7 @@
               <w:rPr>
                 <w:sz w:val="20"/>
               </w:rPr>
-              <w:t>Meaningful commits tracking each feature addition</w:t>
+              <w:t>Meaningful commits tracking each feature</w:t>
             </w:r>
           </w:p>
         </w:tc>
@@ -4228,49 +5169,57 @@
         </w:rPr>
         <w:t>src/</w:t>
         <w:br/>
-        <w:t>├── app/</w:t>
+        <w:t xml:space="preserve">  app/</w:t>
         <w:br/>
-        <w:t>│   ├── layout.tsx                  — Root layout (Server Component)</w:t>
+        <w:t xml:space="preserve">    layout.tsx                        - Root layout (Server Component)</w:t>
         <w:br/>
-        <w:t>│   ├── page.tsx                    — Home page</w:t>
+        <w:t xml:space="preserve">    page.tsx                          - Home page</w:t>
         <w:br/>
-        <w:t>│   ├── globals.css                 — Global styles</w:t>
+        <w:t xml:space="preserve">    posts/new/page.tsx                - Project Idea Form page</w:t>
         <w:br/>
-        <w:t>│   ├── posts/new/page.tsx          — Project Idea Form page</w:t>
+        <w:t xml:space="preserve">    feedback/page.tsx                 - Interactive Feedback Thread</w:t>
         <w:br/>
-        <w:t>│   ├── feedback/page.tsx           — Feedback Thread page</w:t>
+        <w:t xml:space="preserve">    guidance/[projectId]/</w:t>
         <w:br/>
-        <w:t>│   └── guidance/[projectId]/page.tsx — Dynamic Guidance page</w:t>
+        <w:t xml:space="preserve">      page.tsx                        - Guidance page (Server -&gt; Client)</w:t>
         <w:br/>
-        <w:t>├── components/</w:t>
+        <w:t xml:space="preserve">      InteractiveGuidanceClient.tsx   - Client bridge component</w:t>
         <w:br/>
-        <w:t>│   ├── post-form/</w:t>
+        <w:t xml:space="preserve">  components/</w:t>
         <w:br/>
-        <w:t>│   │   ├── PostForm.tsx            — Form wrapper + action handler</w:t>
+        <w:t xml:space="preserve">    post-form/</w:t>
         <w:br/>
-        <w:t>│   │   ├── PostFormClient.tsx      — Interactive form UI (useFormState)</w:t>
+        <w:t xml:space="preserve">      PostForm.tsx                    - Form wrapper + action handler</w:t>
         <w:br/>
-        <w:t>│   │   ├── TagPicker.tsx           — Multi-select tag picker</w:t>
+        <w:t xml:space="preserve">      PostFormClient.tsx              - Interactive form (useFormState)</w:t>
         <w:br/>
-        <w:t>│   │   └── schema.ts              — Zod validation schema</w:t>
+        <w:t xml:space="preserve">      TagPicker.tsx                   - Multi-select tag picker</w:t>
         <w:br/>
-        <w:t>│   ├── feedback-thread/</w:t>
+        <w:t xml:space="preserve">      schema.ts                      - Zod validation schema</w:t>
         <w:br/>
-        <w:t>│   │   ├── FeedbackThread.tsx      — Server Component (tree builder)</w:t>
+        <w:t xml:space="preserve">    feedback-thread/</w:t>
         <w:br/>
-        <w:t>│   │   ├── CommentNode.tsx         — Recursive comment renderer</w:t>
+        <w:t xml:space="preserve">      InteractiveFeedback.tsx         - State manager + comment form</w:t>
         <w:br/>
-        <w:t>│   │   ├── CommentNodeClient.tsx   — Client wrapper</w:t>
+        <w:t xml:space="preserve">      InteractiveCommentNode.tsx      - Recursive renderer + reply form</w:t>
         <w:br/>
-        <w:t>│   │   └── types.ts               — Types + buildCommentTree()</w:t>
+        <w:t xml:space="preserve">      FeedbackThread.tsx              - Server Component (static)</w:t>
         <w:br/>
-        <w:t>│   └── guidance-thread/</w:t>
+        <w:t xml:space="preserve">      CommentNode.tsx                 - Static comment renderer</w:t>
         <w:br/>
-        <w:t>│       ├── GuidanceThread.tsx      — Server Component (data fetch + tree)</w:t>
+        <w:t xml:space="preserve">      types.ts                        - Types + buildCommentTree()</w:t>
         <w:br/>
-        <w:t>│       ├── GuidanceCommentNode.tsx — Recursive comment renderer</w:t>
+        <w:t xml:space="preserve">    guidance-thread/</w:t>
         <w:br/>
-        <w:t>│       └── data.ts                — Types + fetchComments + buildTree</w:t>
+        <w:t xml:space="preserve">      InteractiveGuidance.tsx          - State manager + comment form</w:t>
+        <w:br/>
+        <w:t xml:space="preserve">      InteractiveGuidanceNode.tsx      - Recursive renderer + reply form</w:t>
+        <w:br/>
+        <w:t xml:space="preserve">      GuidanceThread.tsx               - Server Component (static)</w:t>
+        <w:br/>
+        <w:t xml:space="preserve">      GuidanceCommentNode.tsx          - Static comment renderer</w:t>
+        <w:br/>
+        <w:t xml:space="preserve">      data.ts                          - Types + fetchComments + buildTree</w:t>
       </w:r>
     </w:p>
     <w:sectPr>

</xml_diff>

<commit_message>
feat: add interactive comment system + update all docs with new screenshots
</commit_message>
<xml_diff>
--- a/docs/Progress-1-UI-Business-Rules.docx
+++ b/docs/Progress-1-UI-Business-Rules.docx
@@ -7,7 +7,7 @@
         <w:pStyle w:val="Title"/>
       </w:pPr>
       <w:r>
-        <w:t>Progress 1 - UI and Business Rules Document</w:t>
+        <w:t>Progress 1 — UI and Business Rules Document</w:t>
       </w:r>
     </w:p>
     <w:p>
@@ -15,7 +15,7 @@
         <w:rPr>
           <w:b w:val="0"/>
         </w:rPr>
-        <w:t>Module: IT3040 - ITPM | Semester 1</w:t>
+        <w:t>Module: IT3040 – ITPM | Semester 1</w:t>
       </w:r>
     </w:p>
     <w:p>
@@ -23,7 +23,7 @@
         <w:rPr>
           <w:b w:val="0"/>
         </w:rPr>
-        <w:t>Programme: BSc (Hons) in Information Technology - Year 3</w:t>
+        <w:t>Programme: BSc (Hons) in Information Technology — Year 3</w:t>
       </w:r>
     </w:p>
     <w:p>
@@ -195,7 +195,7 @@
               <w:rPr>
                 <w:sz w:val="20"/>
               </w:rPr>
-              <w:t>A web module for submitting project ideas with validation, interactive recursive threaded feedback with Markdown/code support, and guidance threads with live commenting, replying, upvote and accept interactions.</w:t>
+              <w:t>Web module: students submit project ideas with Zod validation, view/post recursive threaded feedback with Markdown/code support, and interact with per-project guidance threads (upvote, accept, nested reply).</w:t>
             </w:r>
           </w:p>
         </w:tc>
@@ -425,7 +425,7 @@
               <w:rPr>
                 <w:sz w:val="20"/>
               </w:rPr>
-              <w:t>/posts/new (short)</w:t>
+              <w:t>/posts/new (short title)</w:t>
             </w:r>
           </w:p>
         </w:tc>
@@ -479,7 +479,7 @@
               <w:rPr>
                 <w:sz w:val="20"/>
               </w:rPr>
-              <w:t>/posts/new (filled)</w:t>
+              <w:t>/posts/new (completed)</w:t>
             </w:r>
           </w:p>
         </w:tc>
@@ -520,7 +520,7 @@
               <w:rPr>
                 <w:sz w:val="20"/>
               </w:rPr>
-              <w:t>Submission Success</w:t>
+              <w:t>Successful Submission</w:t>
             </w:r>
           </w:p>
         </w:tc>
@@ -574,7 +574,7 @@
               <w:rPr>
                 <w:sz w:val="20"/>
               </w:rPr>
-              <w:t>Feedback Thread</w:t>
+              <w:t>Feedback Thread (Interactive)</w:t>
             </w:r>
           </w:p>
         </w:tc>
@@ -600,7 +600,7 @@
               <w:rPr>
                 <w:sz w:val="20"/>
               </w:rPr>
-              <w:t>06-feedback-thread.png</w:t>
+              <w:t>10-feedback-interactive-form.png</w:t>
             </w:r>
           </w:p>
         </w:tc>
@@ -628,7 +628,7 @@
               <w:rPr>
                 <w:sz w:val="20"/>
               </w:rPr>
-              <w:t>Feedback Upvote &amp; Accept</w:t>
+              <w:t>Feedback — Typing a Comment</w:t>
             </w:r>
           </w:p>
         </w:tc>
@@ -641,7 +641,7 @@
               <w:rPr>
                 <w:sz w:val="20"/>
               </w:rPr>
-              <w:t>/feedback (toggled)</w:t>
+              <w:t>/feedback</w:t>
             </w:r>
           </w:p>
         </w:tc>
@@ -654,7 +654,7 @@
               <w:rPr>
                 <w:sz w:val="20"/>
               </w:rPr>
-              <w:t>07-feedback-upvote-accept.png</w:t>
+              <w:t>11-feedback-typed.png</w:t>
             </w:r>
           </w:p>
         </w:tc>
@@ -682,7 +682,7 @@
               <w:rPr>
                 <w:sz w:val="20"/>
               </w:rPr>
-              <w:t>Guidance Thread</w:t>
+              <w:t>Feedback — Comment Posted</w:t>
             </w:r>
           </w:p>
         </w:tc>
@@ -695,7 +695,7 @@
               <w:rPr>
                 <w:sz w:val="20"/>
               </w:rPr>
-              <w:t>/guidance/[projectId]</w:t>
+              <w:t>/feedback</w:t>
             </w:r>
           </w:p>
         </w:tc>
@@ -708,7 +708,7 @@
               <w:rPr>
                 <w:sz w:val="20"/>
               </w:rPr>
-              <w:t>08-guidance-thread.png</w:t>
+              <w:t>12-feedback-posted.png</w:t>
             </w:r>
           </w:p>
         </w:tc>
@@ -736,7 +736,7 @@
               <w:rPr>
                 <w:sz w:val="20"/>
               </w:rPr>
-              <w:t>Guidance Interactions</w:t>
+              <w:t>Feedback — Inline Reply Form</w:t>
             </w:r>
           </w:p>
         </w:tc>
@@ -749,7 +749,7 @@
               <w:rPr>
                 <w:sz w:val="20"/>
               </w:rPr>
-              <w:t>/guidance/[projectId]</w:t>
+              <w:t>/feedback</w:t>
             </w:r>
           </w:p>
         </w:tc>
@@ -762,7 +762,7 @@
               <w:rPr>
                 <w:sz w:val="20"/>
               </w:rPr>
-              <w:t>09-guidance-interactions.png</w:t>
+              <w:t>13-feedback-reply-form.png</w:t>
             </w:r>
           </w:p>
         </w:tc>
@@ -790,7 +790,7 @@
               <w:rPr>
                 <w:sz w:val="20"/>
               </w:rPr>
-              <w:t>Interactive Feedback Form</w:t>
+              <w:t>Feedback — Nested Reply Posted</w:t>
             </w:r>
           </w:p>
         </w:tc>
@@ -803,7 +803,7 @@
               <w:rPr>
                 <w:sz w:val="20"/>
               </w:rPr>
-              <w:t>/feedback (interactive)</w:t>
+              <w:t>/feedback</w:t>
             </w:r>
           </w:p>
         </w:tc>
@@ -816,7 +816,7 @@
               <w:rPr>
                 <w:sz w:val="20"/>
               </w:rPr>
-              <w:t>10-feedback-interactive-form.png</w:t>
+              <w:t>14-feedback-reply-posted.png</w:t>
             </w:r>
           </w:p>
         </w:tc>
@@ -844,7 +844,7 @@
               <w:rPr>
                 <w:sz w:val="20"/>
               </w:rPr>
-              <w:t>Feedback Reply Form</w:t>
+              <w:t>Guidance Thread (Interactive)</w:t>
             </w:r>
           </w:p>
         </w:tc>
@@ -857,7 +857,7 @@
               <w:rPr>
                 <w:sz w:val="20"/>
               </w:rPr>
-              <w:t>/feedback (reply)</w:t>
+              <w:t>/guidance/[projectId]</w:t>
             </w:r>
           </w:p>
         </w:tc>
@@ -870,7 +870,7 @@
               <w:rPr>
                 <w:sz w:val="20"/>
               </w:rPr>
-              <w:t>11-feedback-reply-form.png</w:t>
+              <w:t>15-guidance-interactive.png</w:t>
             </w:r>
           </w:p>
         </w:tc>
@@ -898,7 +898,7 @@
               <w:rPr>
                 <w:sz w:val="20"/>
               </w:rPr>
-              <w:t>Feedback Reply Posted</w:t>
+              <w:t>Guidance — Inline Reply Form</w:t>
             </w:r>
           </w:p>
         </w:tc>
@@ -911,7 +911,7 @@
               <w:rPr>
                 <w:sz w:val="20"/>
               </w:rPr>
-              <w:t>/feedback (nested reply)</w:t>
+              <w:t>/guidance/[projectId]</w:t>
             </w:r>
           </w:p>
         </w:tc>
@@ -924,169 +924,7 @@
               <w:rPr>
                 <w:sz w:val="20"/>
               </w:rPr>
-              <w:t>12-feedback-reply-posted.png</w:t>
-            </w:r>
-          </w:p>
-        </w:tc>
-      </w:tr>
-      <w:tr>
-        <w:tc>
-          <w:tcPr>
-            <w:tcW w:type="dxa" w:w="2160"/>
-          </w:tcPr>
-          <w:p>
-            <w:r>
-              <w:rPr>
-                <w:sz w:val="20"/>
-              </w:rPr>
-              <w:t>UI 13</w:t>
-            </w:r>
-          </w:p>
-        </w:tc>
-        <w:tc>
-          <w:tcPr>
-            <w:tcW w:type="dxa" w:w="2160"/>
-          </w:tcPr>
-          <w:p>
-            <w:r>
-              <w:rPr>
-                <w:sz w:val="20"/>
-              </w:rPr>
-              <w:t>New Root Comment</w:t>
-            </w:r>
-          </w:p>
-        </w:tc>
-        <w:tc>
-          <w:tcPr>
-            <w:tcW w:type="dxa" w:w="2160"/>
-          </w:tcPr>
-          <w:p>
-            <w:r>
-              <w:rPr>
-                <w:sz w:val="20"/>
-              </w:rPr>
-              <w:t>/feedback (new comment)</w:t>
-            </w:r>
-          </w:p>
-        </w:tc>
-        <w:tc>
-          <w:tcPr>
-            <w:tcW w:type="dxa" w:w="2160"/>
-          </w:tcPr>
-          <w:p>
-            <w:r>
-              <w:rPr>
-                <w:sz w:val="20"/>
-              </w:rPr>
-              <w:t>13-feedback-new-comment.png</w:t>
-            </w:r>
-          </w:p>
-        </w:tc>
-      </w:tr>
-      <w:tr>
-        <w:tc>
-          <w:tcPr>
-            <w:tcW w:type="dxa" w:w="2160"/>
-          </w:tcPr>
-          <w:p>
-            <w:r>
-              <w:rPr>
-                <w:sz w:val="20"/>
-              </w:rPr>
-              <w:t>UI 14</w:t>
-            </w:r>
-          </w:p>
-        </w:tc>
-        <w:tc>
-          <w:tcPr>
-            <w:tcW w:type="dxa" w:w="2160"/>
-          </w:tcPr>
-          <w:p>
-            <w:r>
-              <w:rPr>
-                <w:sz w:val="20"/>
-              </w:rPr>
-              <w:t>Interactive Guidance</w:t>
-            </w:r>
-          </w:p>
-        </w:tc>
-        <w:tc>
-          <w:tcPr>
-            <w:tcW w:type="dxa" w:w="2160"/>
-          </w:tcPr>
-          <w:p>
-            <w:r>
-              <w:rPr>
-                <w:sz w:val="20"/>
-              </w:rPr>
-              <w:t>/guidance/1 (interactive)</w:t>
-            </w:r>
-          </w:p>
-        </w:tc>
-        <w:tc>
-          <w:tcPr>
-            <w:tcW w:type="dxa" w:w="2160"/>
-          </w:tcPr>
-          <w:p>
-            <w:r>
-              <w:rPr>
-                <w:sz w:val="20"/>
-              </w:rPr>
-              <w:t>14-guidance-interactive.png</w:t>
-            </w:r>
-          </w:p>
-        </w:tc>
-      </w:tr>
-      <w:tr>
-        <w:tc>
-          <w:tcPr>
-            <w:tcW w:type="dxa" w:w="2160"/>
-          </w:tcPr>
-          <w:p>
-            <w:r>
-              <w:rPr>
-                <w:sz w:val="20"/>
-              </w:rPr>
-              <w:t>UI 15</w:t>
-            </w:r>
-          </w:p>
-        </w:tc>
-        <w:tc>
-          <w:tcPr>
-            <w:tcW w:type="dxa" w:w="2160"/>
-          </w:tcPr>
-          <w:p>
-            <w:r>
-              <w:rPr>
-                <w:sz w:val="20"/>
-              </w:rPr>
-              <w:t>Guidance Reply Form</w:t>
-            </w:r>
-          </w:p>
-        </w:tc>
-        <w:tc>
-          <w:tcPr>
-            <w:tcW w:type="dxa" w:w="2160"/>
-          </w:tcPr>
-          <w:p>
-            <w:r>
-              <w:rPr>
-                <w:sz w:val="20"/>
-              </w:rPr>
-              <w:t>/guidance/1 (reply)</w:t>
-            </w:r>
-          </w:p>
-        </w:tc>
-        <w:tc>
-          <w:tcPr>
-            <w:tcW w:type="dxa" w:w="2160"/>
-          </w:tcPr>
-          <w:p>
-            <w:r>
-              <w:rPr>
-                <w:sz w:val="20"/>
-              </w:rPr>
-              <w:t>15-guidance-reply-form.png</w:t>
+              <w:t>16-guidance-reply-form.png</w:t>
             </w:r>
           </w:p>
         </w:tc>
@@ -1104,14 +942,6 @@
       </w:pPr>
       <w:r>
         <w:t>UI 1 &amp; 2: Project Idea Submission Form (/posts/new)</w:t>
-      </w:r>
-    </w:p>
-    <w:p>
-      <w:pPr>
-        <w:pStyle w:val="Heading2"/>
-      </w:pPr>
-      <w:r>
-        <w:t>Empty Form State</w:t>
       </w:r>
     </w:p>
     <w:p>
@@ -1294,7 +1124,7 @@
               <w:rPr>
                 <w:sz w:val="20"/>
               </w:rPr>
-              <w:t>Descriptive title for the project idea</w:t>
+              <w:t>Descriptive title (min 10 chars)</w:t>
             </w:r>
           </w:p>
         </w:tc>
@@ -1348,7 +1178,7 @@
               <w:rPr>
                 <w:sz w:val="20"/>
               </w:rPr>
-              <w:t>Multi-line description of the problem</w:t>
+              <w:t>Multi-line problem description</w:t>
             </w:r>
           </w:p>
         </w:tc>
@@ -1740,7 +1570,7 @@
               <w:rPr>
                 <w:sz w:val="20"/>
               </w:rPr>
-              <w:t>Required. One of 4 values.</w:t>
+              <w:t>Required. Must be one of 4 values.</w:t>
             </w:r>
           </w:p>
         </w:tc>
@@ -1794,7 +1624,7 @@
               <w:rPr>
                 <w:sz w:val="20"/>
               </w:rPr>
-              <w:t>Optional. Valid URL format.</w:t>
+              <w:t>Optional. Each must be valid URL.</w:t>
             </w:r>
           </w:p>
         </w:tc>
@@ -1861,7 +1691,7 @@
               <w:rPr>
                 <w:sz w:val="20"/>
               </w:rPr>
-              <w:t>-</w:t>
+              <w:t>—</w:t>
             </w:r>
           </w:p>
         </w:tc>
@@ -1902,7 +1732,7 @@
               <w:rPr>
                 <w:sz w:val="20"/>
               </w:rPr>
-              <w:t>Zod safeParse(). Inline red errors.</w:t>
+              <w:t>Validated via Zod safeParse(). Errors shown inline in red.</w:t>
             </w:r>
           </w:p>
         </w:tc>
@@ -1915,7 +1745,7 @@
               <w:rPr>
                 <w:sz w:val="20"/>
               </w:rPr>
-              <w:t>-</w:t>
+              <w:t>—</w:t>
             </w:r>
           </w:p>
         </w:tc>
@@ -1927,7 +1757,7 @@
         <w:pStyle w:val="Heading2"/>
       </w:pPr>
       <w:r>
-        <w:t>Validation Error States</w:t>
+        <w:t>Validation Screenshots</w:t>
       </w:r>
     </w:p>
     <w:p>
@@ -1979,7 +1809,7 @@
           <w:color w:val="646464"/>
           <w:sz w:val="18"/>
         </w:rPr>
-        <w:t>Figure 2: Empty submit showing 3 validation errors</w:t>
+        <w:t>Figure 2: All-field errors on empty submit</w:t>
       </w:r>
     </w:p>
     <w:p>
@@ -2031,7 +1861,7 @@
           <w:color w:val="646464"/>
           <w:sz w:val="18"/>
         </w:rPr>
-        <w:t>Figure 3: "Title must be at least 10 characters"</w:t>
+        <w:t>Figure 3: Title min-length error for "test"</w:t>
       </w:r>
     </w:p>
     <w:p>
@@ -2106,7 +1936,7 @@
               <w:rPr>
                 <w:sz w:val="20"/>
               </w:rPr>
-              <w:t>User fills fields -&gt; Submit Idea -&gt; Zod validates -&gt; success response.</w:t>
+              <w:t>User fills fields → Submit Idea → Zod validates → success or inline errors.</w:t>
             </w:r>
           </w:p>
         </w:tc>
@@ -2134,7 +1964,7 @@
               <w:rPr>
                 <w:sz w:val="20"/>
               </w:rPr>
-              <w:t>Success: green banner shows submitted JSON data.</w:t>
+              <w:t>Success: green banner with submitted data as JSON.</w:t>
             </w:r>
           </w:p>
         </w:tc>
@@ -2162,7 +1992,7 @@
               <w:rPr>
                 <w:sz w:val="20"/>
               </w:rPr>
-              <w:t>Failure: inline red error messages. Entered data preserved.</w:t>
+              <w:t>Failure: form re-renders with inline red errors. Data preserved.</w:t>
             </w:r>
           </w:p>
         </w:tc>
@@ -2190,7 +2020,7 @@
               <w:rPr>
                 <w:sz w:val="20"/>
               </w:rPr>
-              <w:t>Submit button shows "Submitting..." and disables (useFormStatus).</w:t>
+              <w:t>Submit button shows "Submitting…" and disables during processing (useFormStatus).</w:t>
             </w:r>
           </w:p>
         </w:tc>
@@ -2254,7 +2084,7 @@
           <w:color w:val="646464"/>
           <w:sz w:val="18"/>
         </w:rPr>
-        <w:t>Figure 4: Filled form with Prototype variant and 4 tech tags</w:t>
+        <w:t>Figure 4: Filled form with title, problem, Prototype variant, 4 tags selected</w:t>
       </w:r>
     </w:p>
     <w:p>
@@ -2306,7 +2136,7 @@
           <w:color w:val="646464"/>
           <w:sz w:val="18"/>
         </w:rPr>
-        <w:t>Figure 5: "Project idea submitted successfully!" with JSON</w:t>
+        <w:t>Figure 5: Green success banner with JSON output</w:t>
       </w:r>
     </w:p>
     <w:p>
@@ -2381,7 +2211,7 @@
               <w:rPr>
                 <w:sz w:val="20"/>
               </w:rPr>
-              <w:t>Pill-shaped buttons in a horizontal row.</w:t>
+              <w:t>Tags are pill buttons. Click toggles: white → blue filled.</w:t>
             </w:r>
           </w:p>
         </w:tc>
@@ -2409,7 +2239,7 @@
               <w:rPr>
                 <w:sz w:val="20"/>
               </w:rPr>
-              <w:t>Click toggles: white (off) -&gt; blue filled (on).</w:t>
+              <w:t>"N selected" counter updates in real-time.</w:t>
             </w:r>
           </w:p>
         </w:tc>
@@ -2437,7 +2267,7 @@
               <w:rPr>
                 <w:sz w:val="20"/>
               </w:rPr>
-              <w:t>"N selected" counter updates in real-time.</w:t>
+              <w:t>Selected tags serialized as JSON in hidden input.</w:t>
             </w:r>
           </w:p>
         </w:tc>
@@ -2465,35 +2295,7 @@
               <w:rPr>
                 <w:sz w:val="20"/>
               </w:rPr>
-              <w:t>Selected tags serialized as JSON in hidden input.</w:t>
-            </w:r>
-          </w:p>
-        </w:tc>
-      </w:tr>
-      <w:tr>
-        <w:tc>
-          <w:tcPr>
-            <w:tcW w:type="dxa" w:w="4320"/>
-          </w:tcPr>
-          <w:p>
-            <w:r>
-              <w:rPr>
-                <w:sz w:val="20"/>
-              </w:rPr>
-              <w:t>TP-5</w:t>
-            </w:r>
-          </w:p>
-        </w:tc>
-        <w:tc>
-          <w:tcPr>
-            <w:tcW w:type="dxa" w:w="4320"/>
-          </w:tcPr>
-          <w:p>
-            <w:r>
-              <w:rPr>
-                <w:sz w:val="20"/>
-              </w:rPr>
-              <w:t>State managed using Set&lt;string&gt; in useState.</w:t>
+              <w:t>State managed with Set&lt;string&gt; in useState.</w:t>
             </w:r>
           </w:p>
         </w:tc>
@@ -2572,7 +2374,7 @@
               <w:rPr>
                 <w:sz w:val="20"/>
               </w:rPr>
-              <w:t>Starts with one empty URL input.</w:t>
+              <w:t>Form starts with one empty URL input.</w:t>
             </w:r>
           </w:p>
         </w:tc>
@@ -2628,7 +2430,7 @@
               <w:rPr>
                 <w:sz w:val="20"/>
               </w:rPr>
-              <w:t>Red "x" button to remove each entry.</w:t>
+              <w:t>Each extra input has a red × remove button.</w:t>
             </w:r>
           </w:p>
         </w:tc>
@@ -2656,35 +2458,7 @@
               <w:rPr>
                 <w:sz w:val="20"/>
               </w:rPr>
-              <w:t>"N added" counter for non-empty URLs.</w:t>
-            </w:r>
-          </w:p>
-        </w:tc>
-      </w:tr>
-      <w:tr>
-        <w:tc>
-          <w:tcPr>
-            <w:tcW w:type="dxa" w:w="4320"/>
-          </w:tcPr>
-          <w:p>
-            <w:r>
-              <w:rPr>
-                <w:sz w:val="20"/>
-              </w:rPr>
-              <w:t>UL-5</w:t>
-            </w:r>
-          </w:p>
-        </w:tc>
-        <w:tc>
-          <w:tcPr>
-            <w:tcW w:type="dxa" w:w="4320"/>
-          </w:tcPr>
-          <w:p>
-            <w:r>
-              <w:rPr>
-                <w:sz w:val="20"/>
-              </w:rPr>
-              <w:t>Non-empty URLs serialized as JSON in hidden input.</w:t>
+              <w:t>"N added" counter counts non-empty entries.</w:t>
             </w:r>
           </w:p>
         </w:tc>
@@ -2701,7 +2475,7 @@
         <w:pStyle w:val="Heading1"/>
       </w:pPr>
       <w:r>
-        <w:t>UI 3: Interactive Feedback Thread (/feedback)</w:t>
+        <w:t>UI 3: Feedback Thread — Interactive Comment Tree (/feedback)</w:t>
       </w:r>
     </w:p>
     <w:p>
@@ -2753,549 +2527,7 @@
           <w:color w:val="646464"/>
           <w:sz w:val="18"/>
         </w:rPr>
-        <w:t>Figure 6: Interactive feedback with Add Comment form, role selector, and Markdown textarea</w:t>
-      </w:r>
-    </w:p>
-    <w:p>
-      <w:pPr>
-        <w:pStyle w:val="Heading2"/>
-      </w:pPr>
-      <w:r>
-        <w:t>Comment Form Rules (New Root Comments)</w:t>
-      </w:r>
-    </w:p>
-    <w:tbl>
-      <w:tblPr>
-        <w:tblStyle w:val="LightGrid-Accent1"/>
-        <w:tblW w:type="auto" w:w="0"/>
-        <w:jc w:val="center"/>
-        <w:tblLook w:firstColumn="1" w:firstRow="1" w:lastColumn="0" w:lastRow="0" w:noHBand="0" w:noVBand="1" w:val="04A0"/>
-      </w:tblPr>
-      <w:tblGrid>
-        <w:gridCol w:w="4320"/>
-        <w:gridCol w:w="4320"/>
-      </w:tblGrid>
-      <w:tr>
-        <w:tc>
-          <w:tcPr>
-            <w:tcW w:type="dxa" w:w="4320"/>
-          </w:tcPr>
-          <w:p>
-            <w:r>
-              <w:rPr>
-                <w:b/>
-                <w:sz w:val="20"/>
-              </w:rPr>
-              <w:t>#</w:t>
-            </w:r>
-          </w:p>
-        </w:tc>
-        <w:tc>
-          <w:tcPr>
-            <w:tcW w:type="dxa" w:w="4320"/>
-          </w:tcPr>
-          <w:p>
-            <w:r>
-              <w:rPr>
-                <w:b/>
-                <w:sz w:val="20"/>
-              </w:rPr>
-              <w:t>Rule</w:t>
-            </w:r>
-          </w:p>
-        </w:tc>
-      </w:tr>
-      <w:tr>
-        <w:tc>
-          <w:tcPr>
-            <w:tcW w:type="dxa" w:w="4320"/>
-          </w:tcPr>
-          <w:p>
-            <w:r>
-              <w:rPr>
-                <w:sz w:val="20"/>
-              </w:rPr>
-              <w:t>CF-1</w:t>
-            </w:r>
-          </w:p>
-        </w:tc>
-        <w:tc>
-          <w:tcPr>
-            <w:tcW w:type="dxa" w:w="4320"/>
-          </w:tcPr>
-          <w:p>
-            <w:r>
-              <w:rPr>
-                <w:sz w:val="20"/>
-              </w:rPr>
-              <w:t>"Add a Comment" form at top: name input, role selector (Student/Mentor/OP), Markdown textarea.</w:t>
-            </w:r>
-          </w:p>
-        </w:tc>
-      </w:tr>
-      <w:tr>
-        <w:tc>
-          <w:tcPr>
-            <w:tcW w:type="dxa" w:w="4320"/>
-          </w:tcPr>
-          <w:p>
-            <w:r>
-              <w:rPr>
-                <w:sz w:val="20"/>
-              </w:rPr>
-              <w:t>CF-2</w:t>
-            </w:r>
-          </w:p>
-        </w:tc>
-        <w:tc>
-          <w:tcPr>
-            <w:tcW w:type="dxa" w:w="4320"/>
-          </w:tcPr>
-          <w:p>
-            <w:r>
-              <w:rPr>
-                <w:sz w:val="20"/>
-              </w:rPr>
-              <w:t>"Post Comment" adds new root-level node to the tree.</w:t>
-            </w:r>
-          </w:p>
-        </w:tc>
-      </w:tr>
-      <w:tr>
-        <w:tc>
-          <w:tcPr>
-            <w:tcW w:type="dxa" w:w="4320"/>
-          </w:tcPr>
-          <w:p>
-            <w:r>
-              <w:rPr>
-                <w:sz w:val="20"/>
-              </w:rPr>
-              <w:t>CF-3</w:t>
-            </w:r>
-          </w:p>
-        </w:tc>
-        <w:tc>
-          <w:tcPr>
-            <w:tcW w:type="dxa" w:w="4320"/>
-          </w:tcPr>
-          <w:p>
-            <w:r>
-              <w:rPr>
-                <w:sz w:val="20"/>
-              </w:rPr>
-              <w:t>Empty comments rejected (button disabled when textarea empty).</w:t>
-            </w:r>
-          </w:p>
-        </w:tc>
-      </w:tr>
-      <w:tr>
-        <w:tc>
-          <w:tcPr>
-            <w:tcW w:type="dxa" w:w="4320"/>
-          </w:tcPr>
-          <w:p>
-            <w:r>
-              <w:rPr>
-                <w:sz w:val="20"/>
-              </w:rPr>
-              <w:t>CF-4</w:t>
-            </w:r>
-          </w:p>
-        </w:tc>
-        <w:tc>
-          <w:tcPr>
-            <w:tcW w:type="dxa" w:w="4320"/>
-          </w:tcPr>
-          <w:p>
-            <w:r>
-              <w:rPr>
-                <w:sz w:val="20"/>
-              </w:rPr>
-              <w:t>"Total comments: N" counter updates in real-time.</w:t>
-            </w:r>
-          </w:p>
-        </w:tc>
-      </w:tr>
-      <w:tr>
-        <w:tc>
-          <w:tcPr>
-            <w:tcW w:type="dxa" w:w="4320"/>
-          </w:tcPr>
-          <w:p>
-            <w:r>
-              <w:rPr>
-                <w:sz w:val="20"/>
-              </w:rPr>
-              <w:t>CF-5</w:t>
-            </w:r>
-          </w:p>
-        </w:tc>
-        <w:tc>
-          <w:tcPr>
-            <w:tcW w:type="dxa" w:w="4320"/>
-          </w:tcPr>
-          <w:p>
-            <w:r>
-              <w:rPr>
-                <w:sz w:val="20"/>
-              </w:rPr>
-              <w:t>Supports Markdown: **bold**, `code`, code blocks.</w:t>
-            </w:r>
-          </w:p>
-        </w:tc>
-      </w:tr>
-      <w:tr>
-        <w:tc>
-          <w:tcPr>
-            <w:tcW w:type="dxa" w:w="4320"/>
-          </w:tcPr>
-          <w:p>
-            <w:r>
-              <w:rPr>
-                <w:sz w:val="20"/>
-              </w:rPr>
-              <w:t>CF-6</w:t>
-            </w:r>
-          </w:p>
-        </w:tc>
-        <w:tc>
-          <w:tcPr>
-            <w:tcW w:type="dxa" w:w="4320"/>
-          </w:tcPr>
-          <w:p>
-            <w:r>
-              <w:rPr>
-                <w:sz w:val="20"/>
-              </w:rPr>
-              <w:t>Role selector determines badge: Student (none), Mentor (amber), OP (blue).</w:t>
-            </w:r>
-          </w:p>
-        </w:tc>
-      </w:tr>
-    </w:tbl>
-    <w:p/>
-    <w:p>
-      <w:pPr>
-        <w:pStyle w:val="Heading2"/>
-      </w:pPr>
-      <w:r>
-        <w:t>Reply Form Rules (Nested Comments)</w:t>
-      </w:r>
-    </w:p>
-    <w:tbl>
-      <w:tblPr>
-        <w:tblStyle w:val="LightGrid-Accent1"/>
-        <w:tblW w:type="auto" w:w="0"/>
-        <w:jc w:val="center"/>
-        <w:tblLook w:firstColumn="1" w:firstRow="1" w:lastColumn="0" w:lastRow="0" w:noHBand="0" w:noVBand="1" w:val="04A0"/>
-      </w:tblPr>
-      <w:tblGrid>
-        <w:gridCol w:w="4320"/>
-        <w:gridCol w:w="4320"/>
-      </w:tblGrid>
-      <w:tr>
-        <w:tc>
-          <w:tcPr>
-            <w:tcW w:type="dxa" w:w="4320"/>
-          </w:tcPr>
-          <w:p>
-            <w:r>
-              <w:rPr>
-                <w:b/>
-                <w:sz w:val="20"/>
-              </w:rPr>
-              <w:t>#</w:t>
-            </w:r>
-          </w:p>
-        </w:tc>
-        <w:tc>
-          <w:tcPr>
-            <w:tcW w:type="dxa" w:w="4320"/>
-          </w:tcPr>
-          <w:p>
-            <w:r>
-              <w:rPr>
-                <w:b/>
-                <w:sz w:val="20"/>
-              </w:rPr>
-              <w:t>Rule</w:t>
-            </w:r>
-          </w:p>
-        </w:tc>
-      </w:tr>
-      <w:tr>
-        <w:tc>
-          <w:tcPr>
-            <w:tcW w:type="dxa" w:w="4320"/>
-          </w:tcPr>
-          <w:p>
-            <w:r>
-              <w:rPr>
-                <w:sz w:val="20"/>
-              </w:rPr>
-              <w:t>RF-1</w:t>
-            </w:r>
-          </w:p>
-        </w:tc>
-        <w:tc>
-          <w:tcPr>
-            <w:tcW w:type="dxa" w:w="4320"/>
-          </w:tcPr>
-          <w:p>
-            <w:r>
-              <w:rPr>
-                <w:sz w:val="20"/>
-              </w:rPr>
-              <w:t>Each comment has "Reply" button alongside Upvote and Mark Accepted.</w:t>
-            </w:r>
-          </w:p>
-        </w:tc>
-      </w:tr>
-      <w:tr>
-        <w:tc>
-          <w:tcPr>
-            <w:tcW w:type="dxa" w:w="4320"/>
-          </w:tcPr>
-          <w:p>
-            <w:r>
-              <w:rPr>
-                <w:sz w:val="20"/>
-              </w:rPr>
-              <w:t>RF-2</w:t>
-            </w:r>
-          </w:p>
-        </w:tc>
-        <w:tc>
-          <w:tcPr>
-            <w:tcW w:type="dxa" w:w="4320"/>
-          </w:tcPr>
-          <w:p>
-            <w:r>
-              <w:rPr>
-                <w:sz w:val="20"/>
-              </w:rPr>
-              <w:t>Clicking Reply opens inline form below the comment.</w:t>
-            </w:r>
-          </w:p>
-        </w:tc>
-      </w:tr>
-      <w:tr>
-        <w:tc>
-          <w:tcPr>
-            <w:tcW w:type="dxa" w:w="4320"/>
-          </w:tcPr>
-          <w:p>
-            <w:r>
-              <w:rPr>
-                <w:sz w:val="20"/>
-              </w:rPr>
-              <w:t>RF-3</w:t>
-            </w:r>
-          </w:p>
-        </w:tc>
-        <w:tc>
-          <w:tcPr>
-            <w:tcW w:type="dxa" w:w="4320"/>
-          </w:tcPr>
-          <w:p>
-            <w:r>
-              <w:rPr>
-                <w:sz w:val="20"/>
-              </w:rPr>
-              <w:t>Reply button text changes to "Cancel" when form is open.</w:t>
-            </w:r>
-          </w:p>
-        </w:tc>
-      </w:tr>
-      <w:tr>
-        <w:tc>
-          <w:tcPr>
-            <w:tcW w:type="dxa" w:w="4320"/>
-          </w:tcPr>
-          <w:p>
-            <w:r>
-              <w:rPr>
-                <w:sz w:val="20"/>
-              </w:rPr>
-              <w:t>RF-4</w:t>
-            </w:r>
-          </w:p>
-        </w:tc>
-        <w:tc>
-          <w:tcPr>
-            <w:tcW w:type="dxa" w:w="4320"/>
-          </w:tcPr>
-          <w:p>
-            <w:r>
-              <w:rPr>
-                <w:sz w:val="20"/>
-              </w:rPr>
-              <w:t>Reply sets parent_id to target comment id -&gt; renders as nested child.</w:t>
-            </w:r>
-          </w:p>
-        </w:tc>
-      </w:tr>
-      <w:tr>
-        <w:tc>
-          <w:tcPr>
-            <w:tcW w:type="dxa" w:w="4320"/>
-          </w:tcPr>
-          <w:p>
-            <w:r>
-              <w:rPr>
-                <w:sz w:val="20"/>
-              </w:rPr>
-              <w:t>RF-5</w:t>
-            </w:r>
-          </w:p>
-        </w:tc>
-        <w:tc>
-          <w:tcPr>
-            <w:tcW w:type="dxa" w:w="4320"/>
-          </w:tcPr>
-          <w:p>
-            <w:r>
-              <w:rPr>
-                <w:sz w:val="20"/>
-              </w:rPr>
-              <w:t>Reply immediately renders with indentation and left border.</w:t>
-            </w:r>
-          </w:p>
-        </w:tc>
-      </w:tr>
-      <w:tr>
-        <w:tc>
-          <w:tcPr>
-            <w:tcW w:type="dxa" w:w="4320"/>
-          </w:tcPr>
-          <w:p>
-            <w:r>
-              <w:rPr>
-                <w:sz w:val="20"/>
-              </w:rPr>
-              <w:t>RF-6</w:t>
-            </w:r>
-          </w:p>
-        </w:tc>
-        <w:tc>
-          <w:tcPr>
-            <w:tcW w:type="dxa" w:w="4320"/>
-          </w:tcPr>
-          <w:p>
-            <w:r>
-              <w:rPr>
-                <w:sz w:val="20"/>
-              </w:rPr>
-              <w:t>After posting, form closes and textarea clears.</w:t>
-            </w:r>
-          </w:p>
-        </w:tc>
-      </w:tr>
-    </w:tbl>
-    <w:p/>
-    <w:p>
-      <w:pPr>
-        <w:jc w:val="center"/>
-      </w:pPr>
-      <w:r>
-        <w:drawing>
-          <wp:inline xmlns:a="http://schemas.openxmlformats.org/drawingml/2006/main" xmlns:pic="http://schemas.openxmlformats.org/drawingml/2006/picture">
-            <wp:extent cx="5029200" cy="2789634"/>
-            <wp:docPr id="7" name="Picture 7"/>
-            <wp:cNvGraphicFramePr>
-              <a:graphicFrameLocks noChangeAspect="1"/>
-            </wp:cNvGraphicFramePr>
-            <a:graphic>
-              <a:graphicData uri="http://schemas.openxmlformats.org/drawingml/2006/picture">
-                <pic:pic>
-                  <pic:nvPicPr>
-                    <pic:cNvPr id="0" name="11-feedback-reply-form.png"/>
-                    <pic:cNvPicPr/>
-                  </pic:nvPicPr>
-                  <pic:blipFill>
-                    <a:blip r:embed="rId15"/>
-                    <a:stretch>
-                      <a:fillRect/>
-                    </a:stretch>
-                  </pic:blipFill>
-                  <pic:spPr>
-                    <a:xfrm>
-                      <a:off x="0" y="0"/>
-                      <a:ext cx="5029200" cy="2789634"/>
-                    </a:xfrm>
-                    <a:prstGeom prst="rect"/>
-                  </pic:spPr>
-                </pic:pic>
-              </a:graphicData>
-            </a:graphic>
-          </wp:inline>
-        </w:drawing>
-      </w:r>
-    </w:p>
-    <w:p>
-      <w:pPr>
-        <w:jc w:val="center"/>
-      </w:pPr>
-      <w:r>
-        <w:rPr>
-          <w:i/>
-          <w:color w:val="646464"/>
-          <w:sz w:val="18"/>
-        </w:rPr>
-        <w:t>Figure 7: Reply form inline below OP comment - "Reply" changed to "Cancel"</w:t>
-      </w:r>
-    </w:p>
-    <w:p>
-      <w:pPr>
-        <w:jc w:val="center"/>
-      </w:pPr>
-      <w:r>
-        <w:drawing>
-          <wp:inline xmlns:a="http://schemas.openxmlformats.org/drawingml/2006/main" xmlns:pic="http://schemas.openxmlformats.org/drawingml/2006/picture">
-            <wp:extent cx="5029200" cy="2789634"/>
-            <wp:docPr id="8" name="Picture 8"/>
-            <wp:cNvGraphicFramePr>
-              <a:graphicFrameLocks noChangeAspect="1"/>
-            </wp:cNvGraphicFramePr>
-            <a:graphic>
-              <a:graphicData uri="http://schemas.openxmlformats.org/drawingml/2006/picture">
-                <pic:pic>
-                  <pic:nvPicPr>
-                    <pic:cNvPr id="0" name="12-feedback-reply-posted.png"/>
-                    <pic:cNvPicPr/>
-                  </pic:nvPicPr>
-                  <pic:blipFill>
-                    <a:blip r:embed="rId16"/>
-                    <a:stretch>
-                      <a:fillRect/>
-                    </a:stretch>
-                  </pic:blipFill>
-                  <pic:spPr>
-                    <a:xfrm>
-                      <a:off x="0" y="0"/>
-                      <a:ext cx="5029200" cy="2789634"/>
-                    </a:xfrm>
-                    <a:prstGeom prst="rect"/>
-                  </pic:spPr>
-                </pic:pic>
-              </a:graphicData>
-            </a:graphic>
-          </wp:inline>
-        </w:drawing>
-      </w:r>
-    </w:p>
-    <w:p>
-      <w:pPr>
-        <w:jc w:val="center"/>
-      </w:pPr>
-      <w:r>
-        <w:rPr>
-          <w:i/>
-          <w:color w:val="646464"/>
-          <w:sz w:val="18"/>
-        </w:rPr>
-        <w:t>Figure 8: Newly posted reply nested under parent</w:t>
+        <w:t>Figure 6: Interactive Feedback Thread with Add-a-Comment form at top</w:t>
       </w:r>
     </w:p>
     <w:p>
@@ -3370,7 +2602,7 @@
               <w:rPr>
                 <w:sz w:val="20"/>
               </w:rPr>
-              <w:t>Recursive tree rendering with left blue border indentation.</w:t>
+              <w:t>Comments rendered as recursive indented tree (ml-6 border-l-2 per depth level).</w:t>
             </w:r>
           </w:p>
         </w:tc>
@@ -3398,7 +2630,7 @@
               <w:rPr>
                 <w:sz w:val="20"/>
               </w:rPr>
-              <w:t>Unlimited nesting depth.</w:t>
+              <w:t>Unlimited nesting depth supported.</w:t>
             </w:r>
           </w:p>
         </w:tc>
@@ -3426,7 +2658,7 @@
               <w:rPr>
                 <w:sz w:val="20"/>
               </w:rPr>
-              <w:t>Mentor: amber "Mentor" badge. OP: blue "OP" badge.</w:t>
+              <w:t>Mentor: amber "Mentor" badge. OP: blue "OP" badge. Student: no badge.</w:t>
             </w:r>
           </w:p>
         </w:tc>
@@ -3454,7 +2686,35 @@
               <w:rPr>
                 <w:sz w:val="20"/>
               </w:rPr>
-              <w:t>Full Markdown support with Prism syntax highlighting.</w:t>
+              <w:t>Comment bodies support Markdown: bold, links, inline code, fenced code blocks.</w:t>
+            </w:r>
+          </w:p>
+        </w:tc>
+      </w:tr>
+      <w:tr>
+        <w:tc>
+          <w:tcPr>
+            <w:tcW w:type="dxa" w:w="4320"/>
+          </w:tcPr>
+          <w:p>
+            <w:r>
+              <w:rPr>
+                <w:sz w:val="20"/>
+              </w:rPr>
+              <w:t>DR-5</w:t>
+            </w:r>
+          </w:p>
+        </w:tc>
+        <w:tc>
+          <w:tcPr>
+            <w:tcW w:type="dxa" w:w="4320"/>
+          </w:tcPr>
+          <w:p>
+            <w:r>
+              <w:rPr>
+                <w:sz w:val="20"/>
+              </w:rPr>
+              <w:t>Fenced code blocks rendered with Prism syntax highlighting (oneLight theme).</w:t>
             </w:r>
           </w:p>
         </w:tc>
@@ -3466,7 +2726,681 @@
         <w:pStyle w:val="Heading2"/>
       </w:pPr>
       <w:r>
-        <w:t>Upvote &amp; Accept Rules</w:t>
+        <w:t>New Comment Form Rules</w:t>
+      </w:r>
+    </w:p>
+    <w:tbl>
+      <w:tblPr>
+        <w:tblStyle w:val="LightGrid-Accent1"/>
+        <w:tblW w:type="auto" w:w="0"/>
+        <w:jc w:val="center"/>
+        <w:tblLook w:firstColumn="1" w:firstRow="1" w:lastColumn="0" w:lastRow="0" w:noHBand="0" w:noVBand="1" w:val="04A0"/>
+      </w:tblPr>
+      <w:tblGrid>
+        <w:gridCol w:w="4320"/>
+        <w:gridCol w:w="4320"/>
+      </w:tblGrid>
+      <w:tr>
+        <w:tc>
+          <w:tcPr>
+            <w:tcW w:type="dxa" w:w="4320"/>
+          </w:tcPr>
+          <w:p>
+            <w:r>
+              <w:rPr>
+                <w:b/>
+                <w:sz w:val="20"/>
+              </w:rPr>
+              <w:t>#</w:t>
+            </w:r>
+          </w:p>
+        </w:tc>
+        <w:tc>
+          <w:tcPr>
+            <w:tcW w:type="dxa" w:w="4320"/>
+          </w:tcPr>
+          <w:p>
+            <w:r>
+              <w:rPr>
+                <w:b/>
+                <w:sz w:val="20"/>
+              </w:rPr>
+              <w:t>Rule</w:t>
+            </w:r>
+          </w:p>
+        </w:tc>
+      </w:tr>
+      <w:tr>
+        <w:tc>
+          <w:tcPr>
+            <w:tcW w:type="dxa" w:w="4320"/>
+          </w:tcPr>
+          <w:p>
+            <w:r>
+              <w:rPr>
+                <w:sz w:val="20"/>
+              </w:rPr>
+              <w:t>CF-1</w:t>
+            </w:r>
+          </w:p>
+        </w:tc>
+        <w:tc>
+          <w:tcPr>
+            <w:tcW w:type="dxa" w:w="4320"/>
+          </w:tcPr>
+          <w:p>
+            <w:r>
+              <w:rPr>
+                <w:sz w:val="20"/>
+              </w:rPr>
+              <w:t>"Add a Comment" form displayed at top of page, above the thread.</w:t>
+            </w:r>
+          </w:p>
+        </w:tc>
+      </w:tr>
+      <w:tr>
+        <w:tc>
+          <w:tcPr>
+            <w:tcW w:type="dxa" w:w="4320"/>
+          </w:tcPr>
+          <w:p>
+            <w:r>
+              <w:rPr>
+                <w:sz w:val="20"/>
+              </w:rPr>
+              <w:t>CF-2</w:t>
+            </w:r>
+          </w:p>
+        </w:tc>
+        <w:tc>
+          <w:tcPr>
+            <w:tcW w:type="dxa" w:w="4320"/>
+          </w:tcPr>
+          <w:p>
+            <w:r>
+              <w:rPr>
+                <w:sz w:val="20"/>
+              </w:rPr>
+              <w:t>User sets name (text input) and role (Student / Mentor / OP) before posting.</w:t>
+            </w:r>
+          </w:p>
+        </w:tc>
+      </w:tr>
+      <w:tr>
+        <w:tc>
+          <w:tcPr>
+            <w:tcW w:type="dxa" w:w="4320"/>
+          </w:tcPr>
+          <w:p>
+            <w:r>
+              <w:rPr>
+                <w:sz w:val="20"/>
+              </w:rPr>
+              <w:t>CF-3</w:t>
+            </w:r>
+          </w:p>
+        </w:tc>
+        <w:tc>
+          <w:tcPr>
+            <w:tcW w:type="dxa" w:w="4320"/>
+          </w:tcPr>
+          <w:p>
+            <w:r>
+              <w:rPr>
+                <w:sz w:val="20"/>
+              </w:rPr>
+              <w:t>Textarea supports Markdown. Placeholder demonstrates supported syntax.</w:t>
+            </w:r>
+          </w:p>
+        </w:tc>
+      </w:tr>
+      <w:tr>
+        <w:tc>
+          <w:tcPr>
+            <w:tcW w:type="dxa" w:w="4320"/>
+          </w:tcPr>
+          <w:p>
+            <w:r>
+              <w:rPr>
+                <w:sz w:val="20"/>
+              </w:rPr>
+              <w:t>CF-4</w:t>
+            </w:r>
+          </w:p>
+        </w:tc>
+        <w:tc>
+          <w:tcPr>
+            <w:tcW w:type="dxa" w:w="4320"/>
+          </w:tcPr>
+          <w:p>
+            <w:r>
+              <w:rPr>
+                <w:sz w:val="20"/>
+              </w:rPr>
+              <w:t>"Post Comment" button is disabled while textarea is empty.</w:t>
+            </w:r>
+          </w:p>
+        </w:tc>
+      </w:tr>
+      <w:tr>
+        <w:tc>
+          <w:tcPr>
+            <w:tcW w:type="dxa" w:w="4320"/>
+          </w:tcPr>
+          <w:p>
+            <w:r>
+              <w:rPr>
+                <w:sz w:val="20"/>
+              </w:rPr>
+              <w:t>CF-5</w:t>
+            </w:r>
+          </w:p>
+        </w:tc>
+        <w:tc>
+          <w:tcPr>
+            <w:tcW w:type="dxa" w:w="4320"/>
+          </w:tcPr>
+          <w:p>
+            <w:r>
+              <w:rPr>
+                <w:sz w:val="20"/>
+              </w:rPr>
+              <w:t>On submit: comment added to tree root. Textarea clears.</w:t>
+            </w:r>
+          </w:p>
+        </w:tc>
+      </w:tr>
+      <w:tr>
+        <w:tc>
+          <w:tcPr>
+            <w:tcW w:type="dxa" w:w="4320"/>
+          </w:tcPr>
+          <w:p>
+            <w:r>
+              <w:rPr>
+                <w:sz w:val="20"/>
+              </w:rPr>
+              <w:t>CF-6</w:t>
+            </w:r>
+          </w:p>
+        </w:tc>
+        <w:tc>
+          <w:tcPr>
+            <w:tcW w:type="dxa" w:w="4320"/>
+          </w:tcPr>
+          <w:p>
+            <w:r>
+              <w:rPr>
+                <w:sz w:val="20"/>
+              </w:rPr>
+              <w:t>Stats bar shows total comments + root count, updating in real-time.</w:t>
+            </w:r>
+          </w:p>
+        </w:tc>
+      </w:tr>
+    </w:tbl>
+    <w:p/>
+    <w:p>
+      <w:pPr>
+        <w:jc w:val="center"/>
+      </w:pPr>
+      <w:r>
+        <w:drawing>
+          <wp:inline xmlns:a="http://schemas.openxmlformats.org/drawingml/2006/main" xmlns:pic="http://schemas.openxmlformats.org/drawingml/2006/picture">
+            <wp:extent cx="5029200" cy="2789634"/>
+            <wp:docPr id="7" name="Picture 7"/>
+            <wp:cNvGraphicFramePr>
+              <a:graphicFrameLocks noChangeAspect="1"/>
+            </wp:cNvGraphicFramePr>
+            <a:graphic>
+              <a:graphicData uri="http://schemas.openxmlformats.org/drawingml/2006/picture">
+                <pic:pic>
+                  <pic:nvPicPr>
+                    <pic:cNvPr id="0" name="11-feedback-typed.png"/>
+                    <pic:cNvPicPr/>
+                  </pic:nvPicPr>
+                  <pic:blipFill>
+                    <a:blip r:embed="rId15"/>
+                    <a:stretch>
+                      <a:fillRect/>
+                    </a:stretch>
+                  </pic:blipFill>
+                  <pic:spPr>
+                    <a:xfrm>
+                      <a:off x="0" y="0"/>
+                      <a:ext cx="5029200" cy="2789634"/>
+                    </a:xfrm>
+                    <a:prstGeom prst="rect"/>
+                  </pic:spPr>
+                </pic:pic>
+              </a:graphicData>
+            </a:graphic>
+          </wp:inline>
+        </w:drawing>
+      </w:r>
+    </w:p>
+    <w:p>
+      <w:pPr>
+        <w:jc w:val="center"/>
+      </w:pPr>
+      <w:r>
+        <w:rPr>
+          <w:i/>
+          <w:color w:val="646464"/>
+          <w:sz w:val="18"/>
+        </w:rPr>
+        <w:t>Figure 7: Markdown comment typed in the Add-a-Comment form</w:t>
+      </w:r>
+    </w:p>
+    <w:p>
+      <w:pPr>
+        <w:jc w:val="center"/>
+      </w:pPr>
+      <w:r>
+        <w:drawing>
+          <wp:inline xmlns:a="http://schemas.openxmlformats.org/drawingml/2006/main" xmlns:pic="http://schemas.openxmlformats.org/drawingml/2006/picture">
+            <wp:extent cx="5029200" cy="2789634"/>
+            <wp:docPr id="8" name="Picture 8"/>
+            <wp:cNvGraphicFramePr>
+              <a:graphicFrameLocks noChangeAspect="1"/>
+            </wp:cNvGraphicFramePr>
+            <a:graphic>
+              <a:graphicData uri="http://schemas.openxmlformats.org/drawingml/2006/picture">
+                <pic:pic>
+                  <pic:nvPicPr>
+                    <pic:cNvPr id="0" name="12-feedback-posted.png"/>
+                    <pic:cNvPicPr/>
+                  </pic:nvPicPr>
+                  <pic:blipFill>
+                    <a:blip r:embed="rId16"/>
+                    <a:stretch>
+                      <a:fillRect/>
+                    </a:stretch>
+                  </pic:blipFill>
+                  <pic:spPr>
+                    <a:xfrm>
+                      <a:off x="0" y="0"/>
+                      <a:ext cx="5029200" cy="2789634"/>
+                    </a:xfrm>
+                    <a:prstGeom prst="rect"/>
+                  </pic:spPr>
+                </pic:pic>
+              </a:graphicData>
+            </a:graphic>
+          </wp:inline>
+        </w:drawing>
+      </w:r>
+    </w:p>
+    <w:p>
+      <w:pPr>
+        <w:jc w:val="center"/>
+      </w:pPr>
+      <w:r>
+        <w:rPr>
+          <w:i/>
+          <w:color w:val="646464"/>
+          <w:sz w:val="18"/>
+        </w:rPr>
+        <w:t>Figure 8: New comment posted and appearing in the thread</w:t>
+      </w:r>
+    </w:p>
+    <w:p>
+      <w:pPr>
+        <w:pStyle w:val="Heading2"/>
+      </w:pPr>
+      <w:r>
+        <w:t>Reply (Nested Comment) Rules</w:t>
+      </w:r>
+    </w:p>
+    <w:tbl>
+      <w:tblPr>
+        <w:tblStyle w:val="LightGrid-Accent1"/>
+        <w:tblW w:type="auto" w:w="0"/>
+        <w:jc w:val="center"/>
+        <w:tblLook w:firstColumn="1" w:firstRow="1" w:lastColumn="0" w:lastRow="0" w:noHBand="0" w:noVBand="1" w:val="04A0"/>
+      </w:tblPr>
+      <w:tblGrid>
+        <w:gridCol w:w="4320"/>
+        <w:gridCol w:w="4320"/>
+      </w:tblGrid>
+      <w:tr>
+        <w:tc>
+          <w:tcPr>
+            <w:tcW w:type="dxa" w:w="4320"/>
+          </w:tcPr>
+          <w:p>
+            <w:r>
+              <w:rPr>
+                <w:b/>
+                <w:sz w:val="20"/>
+              </w:rPr>
+              <w:t>#</w:t>
+            </w:r>
+          </w:p>
+        </w:tc>
+        <w:tc>
+          <w:tcPr>
+            <w:tcW w:type="dxa" w:w="4320"/>
+          </w:tcPr>
+          <w:p>
+            <w:r>
+              <w:rPr>
+                <w:b/>
+                <w:sz w:val="20"/>
+              </w:rPr>
+              <w:t>Rule</w:t>
+            </w:r>
+          </w:p>
+        </w:tc>
+      </w:tr>
+      <w:tr>
+        <w:tc>
+          <w:tcPr>
+            <w:tcW w:type="dxa" w:w="4320"/>
+          </w:tcPr>
+          <w:p>
+            <w:r>
+              <w:rPr>
+                <w:sz w:val="20"/>
+              </w:rPr>
+              <w:t>RP-1</w:t>
+            </w:r>
+          </w:p>
+        </w:tc>
+        <w:tc>
+          <w:tcPr>
+            <w:tcW w:type="dxa" w:w="4320"/>
+          </w:tcPr>
+          <w:p>
+            <w:r>
+              <w:rPr>
+                <w:sz w:val="20"/>
+              </w:rPr>
+              <w:t>Every comment has a "Reply" button next to Upvote and Accept.</w:t>
+            </w:r>
+          </w:p>
+        </w:tc>
+      </w:tr>
+      <w:tr>
+        <w:tc>
+          <w:tcPr>
+            <w:tcW w:type="dxa" w:w="4320"/>
+          </w:tcPr>
+          <w:p>
+            <w:r>
+              <w:rPr>
+                <w:sz w:val="20"/>
+              </w:rPr>
+              <w:t>RP-2</w:t>
+            </w:r>
+          </w:p>
+        </w:tc>
+        <w:tc>
+          <w:tcPr>
+            <w:tcW w:type="dxa" w:w="4320"/>
+          </w:tcPr>
+          <w:p>
+            <w:r>
+              <w:rPr>
+                <w:sz w:val="20"/>
+              </w:rPr>
+              <w:t>Clicking Reply expands an inline reply form directly below the comment.</w:t>
+            </w:r>
+          </w:p>
+        </w:tc>
+      </w:tr>
+      <w:tr>
+        <w:tc>
+          <w:tcPr>
+            <w:tcW w:type="dxa" w:w="4320"/>
+          </w:tcPr>
+          <w:p>
+            <w:r>
+              <w:rPr>
+                <w:sz w:val="20"/>
+              </w:rPr>
+              <w:t>RP-3</w:t>
+            </w:r>
+          </w:p>
+        </w:tc>
+        <w:tc>
+          <w:tcPr>
+            <w:tcW w:type="dxa" w:w="4320"/>
+          </w:tcPr>
+          <w:p>
+            <w:r>
+              <w:rPr>
+                <w:sz w:val="20"/>
+              </w:rPr>
+              <w:t>Reply form has name + role selector + textarea + Post Reply button.</w:t>
+            </w:r>
+          </w:p>
+        </w:tc>
+      </w:tr>
+      <w:tr>
+        <w:tc>
+          <w:tcPr>
+            <w:tcW w:type="dxa" w:w="4320"/>
+          </w:tcPr>
+          <w:p>
+            <w:r>
+              <w:rPr>
+                <w:sz w:val="20"/>
+              </w:rPr>
+              <w:t>RP-4</w:t>
+            </w:r>
+          </w:p>
+        </w:tc>
+        <w:tc>
+          <w:tcPr>
+            <w:tcW w:type="dxa" w:w="4320"/>
+          </w:tcPr>
+          <w:p>
+            <w:r>
+              <w:rPr>
+                <w:sz w:val="20"/>
+              </w:rPr>
+              <w:t>Cancel collapses the form without posting.</w:t>
+            </w:r>
+          </w:p>
+        </w:tc>
+      </w:tr>
+      <w:tr>
+        <w:tc>
+          <w:tcPr>
+            <w:tcW w:type="dxa" w:w="4320"/>
+          </w:tcPr>
+          <w:p>
+            <w:r>
+              <w:rPr>
+                <w:sz w:val="20"/>
+              </w:rPr>
+              <w:t>RP-5</w:t>
+            </w:r>
+          </w:p>
+        </w:tc>
+        <w:tc>
+          <w:tcPr>
+            <w:tcW w:type="dxa" w:w="4320"/>
+          </w:tcPr>
+          <w:p>
+            <w:r>
+              <w:rPr>
+                <w:sz w:val="20"/>
+              </w:rPr>
+              <w:t>"Post Reply" disabled while textarea is empty. Textarea auto-focuses.</w:t>
+            </w:r>
+          </w:p>
+        </w:tc>
+      </w:tr>
+      <w:tr>
+        <w:tc>
+          <w:tcPr>
+            <w:tcW w:type="dxa" w:w="4320"/>
+          </w:tcPr>
+          <w:p>
+            <w:r>
+              <w:rPr>
+                <w:sz w:val="20"/>
+              </w:rPr>
+              <w:t>RP-6</w:t>
+            </w:r>
+          </w:p>
+        </w:tc>
+        <w:tc>
+          <w:tcPr>
+            <w:tcW w:type="dxa" w:w="4320"/>
+          </w:tcPr>
+          <w:p>
+            <w:r>
+              <w:rPr>
+                <w:sz w:val="20"/>
+              </w:rPr>
+              <w:t>On submit: reply added as child of that comment (depth + 1).</w:t>
+            </w:r>
+          </w:p>
+        </w:tc>
+      </w:tr>
+      <w:tr>
+        <w:tc>
+          <w:tcPr>
+            <w:tcW w:type="dxa" w:w="4320"/>
+          </w:tcPr>
+          <w:p>
+            <w:r>
+              <w:rPr>
+                <w:sz w:val="20"/>
+              </w:rPr>
+              <w:t>RP-7</w:t>
+            </w:r>
+          </w:p>
+        </w:tc>
+        <w:tc>
+          <w:tcPr>
+            <w:tcW w:type="dxa" w:w="4320"/>
+          </w:tcPr>
+          <w:p>
+            <w:r>
+              <w:rPr>
+                <w:sz w:val="20"/>
+              </w:rPr>
+              <w:t>Reply form clears and collapses after posting.</w:t>
+            </w:r>
+          </w:p>
+        </w:tc>
+      </w:tr>
+    </w:tbl>
+    <w:p/>
+    <w:p>
+      <w:pPr>
+        <w:jc w:val="center"/>
+      </w:pPr>
+      <w:r>
+        <w:drawing>
+          <wp:inline xmlns:a="http://schemas.openxmlformats.org/drawingml/2006/main" xmlns:pic="http://schemas.openxmlformats.org/drawingml/2006/picture">
+            <wp:extent cx="5029200" cy="2789634"/>
+            <wp:docPr id="9" name="Picture 9"/>
+            <wp:cNvGraphicFramePr>
+              <a:graphicFrameLocks noChangeAspect="1"/>
+            </wp:cNvGraphicFramePr>
+            <a:graphic>
+              <a:graphicData uri="http://schemas.openxmlformats.org/drawingml/2006/picture">
+                <pic:pic>
+                  <pic:nvPicPr>
+                    <pic:cNvPr id="0" name="13-feedback-reply-form.png"/>
+                    <pic:cNvPicPr/>
+                  </pic:nvPicPr>
+                  <pic:blipFill>
+                    <a:blip r:embed="rId17"/>
+                    <a:stretch>
+                      <a:fillRect/>
+                    </a:stretch>
+                  </pic:blipFill>
+                  <pic:spPr>
+                    <a:xfrm>
+                      <a:off x="0" y="0"/>
+                      <a:ext cx="5029200" cy="2789634"/>
+                    </a:xfrm>
+                    <a:prstGeom prst="rect"/>
+                  </pic:spPr>
+                </pic:pic>
+              </a:graphicData>
+            </a:graphic>
+          </wp:inline>
+        </w:drawing>
+      </w:r>
+    </w:p>
+    <w:p>
+      <w:pPr>
+        <w:jc w:val="center"/>
+      </w:pPr>
+      <w:r>
+        <w:rPr>
+          <w:i/>
+          <w:color w:val="646464"/>
+          <w:sz w:val="18"/>
+        </w:rPr>
+        <w:t>Figure 9: Inline reply form expanded under the OP comment</w:t>
+      </w:r>
+    </w:p>
+    <w:p>
+      <w:pPr>
+        <w:jc w:val="center"/>
+      </w:pPr>
+      <w:r>
+        <w:drawing>
+          <wp:inline xmlns:a="http://schemas.openxmlformats.org/drawingml/2006/main" xmlns:pic="http://schemas.openxmlformats.org/drawingml/2006/picture">
+            <wp:extent cx="5029200" cy="2789634"/>
+            <wp:docPr id="10" name="Picture 10"/>
+            <wp:cNvGraphicFramePr>
+              <a:graphicFrameLocks noChangeAspect="1"/>
+            </wp:cNvGraphicFramePr>
+            <a:graphic>
+              <a:graphicData uri="http://schemas.openxmlformats.org/drawingml/2006/picture">
+                <pic:pic>
+                  <pic:nvPicPr>
+                    <pic:cNvPr id="0" name="14-feedback-reply-posted.png"/>
+                    <pic:cNvPicPr/>
+                  </pic:nvPicPr>
+                  <pic:blipFill>
+                    <a:blip r:embed="rId18"/>
+                    <a:stretch>
+                      <a:fillRect/>
+                    </a:stretch>
+                  </pic:blipFill>
+                  <pic:spPr>
+                    <a:xfrm>
+                      <a:off x="0" y="0"/>
+                      <a:ext cx="5029200" cy="2789634"/>
+                    </a:xfrm>
+                    <a:prstGeom prst="rect"/>
+                  </pic:spPr>
+                </pic:pic>
+              </a:graphicData>
+            </a:graphic>
+          </wp:inline>
+        </w:drawing>
+      </w:r>
+    </w:p>
+    <w:p>
+      <w:pPr>
+        <w:jc w:val="center"/>
+      </w:pPr>
+      <w:r>
+        <w:rPr>
+          <w:i/>
+          <w:color w:val="646464"/>
+          <w:sz w:val="18"/>
+        </w:rPr>
+        <w:t>Figure 10: Nested reply posted and visible in the thread</w:t>
+      </w:r>
+    </w:p>
+    <w:p>
+      <w:pPr>
+        <w:pStyle w:val="Heading2"/>
+      </w:pPr>
+      <w:r>
+        <w:t>Upvote &amp; Accept Toggle Rules</w:t>
       </w:r>
     </w:p>
     <w:tbl>
@@ -3533,7 +3467,35 @@
               <w:rPr>
                 <w:sz w:val="20"/>
               </w:rPr>
-              <w:t>"Upvote" toggles to "Upvoted" (blue, aria-pressed=true).</w:t>
+              <w:t>Upvote toggles blue (bg-blue-800) on click; toggles back on second click.</w:t>
+            </w:r>
+          </w:p>
+        </w:tc>
+      </w:tr>
+      <w:tr>
+        <w:tc>
+          <w:tcPr>
+            <w:tcW w:type="dxa" w:w="4320"/>
+          </w:tcPr>
+          <w:p>
+            <w:r>
+              <w:rPr>
+                <w:sz w:val="20"/>
+              </w:rPr>
+              <w:t>AS-1</w:t>
+            </w:r>
+          </w:p>
+        </w:tc>
+        <w:tc>
+          <w:tcPr>
+            <w:tcW w:type="dxa" w:w="4320"/>
+          </w:tcPr>
+          <w:p>
+            <w:r>
+              <w:rPr>
+                <w:sz w:val="20"/>
+              </w:rPr>
+              <w:t>Mark Accepted (OP only) toggles green (bg-green-700). Independent of Upvote.</w:t>
             </w:r>
           </w:p>
         </w:tc>
@@ -3561,63 +3523,7 @@
               <w:rPr>
                 <w:sz w:val="20"/>
               </w:rPr>
-              <w:t>Per-comment, independent, client-side (useState).</w:t>
-            </w:r>
-          </w:p>
-        </w:tc>
-      </w:tr>
-      <w:tr>
-        <w:tc>
-          <w:tcPr>
-            <w:tcW w:type="dxa" w:w="4320"/>
-          </w:tcPr>
-          <w:p>
-            <w:r>
-              <w:rPr>
-                <w:sz w:val="20"/>
-              </w:rPr>
-              <w:t>AS-1</w:t>
-            </w:r>
-          </w:p>
-        </w:tc>
-        <w:tc>
-          <w:tcPr>
-            <w:tcW w:type="dxa" w:w="4320"/>
-          </w:tcPr>
-          <w:p>
-            <w:r>
-              <w:rPr>
-                <w:sz w:val="20"/>
-              </w:rPr>
-              <w:t>"Mark Accepted" only when isOP={true}. Toggles green.</w:t>
-            </w:r>
-          </w:p>
-        </w:tc>
-      </w:tr>
-      <w:tr>
-        <w:tc>
-          <w:tcPr>
-            <w:tcW w:type="dxa" w:w="4320"/>
-          </w:tcPr>
-          <w:p>
-            <w:r>
-              <w:rPr>
-                <w:sz w:val="20"/>
-              </w:rPr>
-              <w:t>AS-2</w:t>
-            </w:r>
-          </w:p>
-        </w:tc>
-        <w:tc>
-          <w:tcPr>
-            <w:tcW w:type="dxa" w:w="4320"/>
-          </w:tcPr>
-          <w:p>
-            <w:r>
-              <w:rPr>
-                <w:sz w:val="20"/>
-              </w:rPr>
-              <w:t>Upvote and Accept are independent - both can be active.</w:t>
+              <w:t>Both states are client-side only (useState). Resets on page reload.</w:t>
             </w:r>
           </w:p>
         </w:tc>
@@ -3626,62 +3532,10 @@
     <w:p/>
     <w:p>
       <w:pPr>
-        <w:jc w:val="center"/>
-      </w:pPr>
-      <w:r>
-        <w:drawing>
-          <wp:inline xmlns:a="http://schemas.openxmlformats.org/drawingml/2006/main" xmlns:pic="http://schemas.openxmlformats.org/drawingml/2006/picture">
-            <wp:extent cx="5029200" cy="2789634"/>
-            <wp:docPr id="9" name="Picture 9"/>
-            <wp:cNvGraphicFramePr>
-              <a:graphicFrameLocks noChangeAspect="1"/>
-            </wp:cNvGraphicFramePr>
-            <a:graphic>
-              <a:graphicData uri="http://schemas.openxmlformats.org/drawingml/2006/picture">
-                <pic:pic>
-                  <pic:nvPicPr>
-                    <pic:cNvPr id="0" name="07-feedback-upvote-accept.png"/>
-                    <pic:cNvPicPr/>
-                  </pic:nvPicPr>
-                  <pic:blipFill>
-                    <a:blip r:embed="rId17"/>
-                    <a:stretch>
-                      <a:fillRect/>
-                    </a:stretch>
-                  </pic:blipFill>
-                  <pic:spPr>
-                    <a:xfrm>
-                      <a:off x="0" y="0"/>
-                      <a:ext cx="5029200" cy="2789634"/>
-                    </a:xfrm>
-                    <a:prstGeom prst="rect"/>
-                  </pic:spPr>
-                </pic:pic>
-              </a:graphicData>
-            </a:graphic>
-          </wp:inline>
-        </w:drawing>
-      </w:r>
-    </w:p>
-    <w:p>
-      <w:pPr>
-        <w:jc w:val="center"/>
-      </w:pPr>
-      <w:r>
-        <w:rPr>
-          <w:i/>
-          <w:color w:val="646464"/>
-          <w:sz w:val="18"/>
-        </w:rPr>
-        <w:t>Figure 9: "Upvoted" (blue) and "Accepted" (green) simultaneously</w:t>
-      </w:r>
-    </w:p>
-    <w:p>
-      <w:pPr>
         <w:pStyle w:val="Heading2"/>
       </w:pPr>
       <w:r>
-        <w:t>Tree Building Algorithm</w:t>
+        <w:t>Tree State Management</w:t>
       </w:r>
     </w:p>
     <w:tbl>
@@ -3735,7 +3589,7 @@
               <w:rPr>
                 <w:sz w:val="20"/>
               </w:rPr>
-              <w:t>TB-1</w:t>
+              <w:t>TM-1</w:t>
             </w:r>
           </w:p>
         </w:tc>
@@ -3748,7 +3602,7 @@
               <w:rPr>
                 <w:sz w:val="20"/>
               </w:rPr>
-              <w:t>buildCommentTree(): two-pass O(n) algorithm with Map.</w:t>
+              <w:t>Flat Comment[] array in useState — seed data + user-added comments.</w:t>
             </w:r>
           </w:p>
         </w:tc>
@@ -3763,7 +3617,7 @@
               <w:rPr>
                 <w:sz w:val="20"/>
               </w:rPr>
-              <w:t>TB-2</w:t>
+              <w:t>TM-2</w:t>
             </w:r>
           </w:p>
         </w:tc>
@@ -3776,7 +3630,7 @@
               <w:rPr>
                 <w:sz w:val="20"/>
               </w:rPr>
-              <w:t>Pass 1: Index. Pass 2: Link children via parent_id.</w:t>
+              <w:t>buildCommentTree() rebuilds the nested tree on every re-render.</w:t>
             </w:r>
           </w:p>
         </w:tc>
@@ -3791,7 +3645,7 @@
               <w:rPr>
                 <w:sz w:val="20"/>
               </w:rPr>
-              <w:t>TB-3</w:t>
+              <w:t>TM-3</w:t>
             </w:r>
           </w:p>
         </w:tc>
@@ -3804,7 +3658,7 @@
               <w:rPr>
                 <w:sz w:val="20"/>
               </w:rPr>
-              <w:t>Orphan comments promoted to root level.</w:t>
+              <w:t>New comments appended with unique id (Date.now() + random suffix).</w:t>
             </w:r>
           </w:p>
         </w:tc>
@@ -3819,7 +3673,7 @@
               <w:rPr>
                 <w:sz w:val="20"/>
               </w:rPr>
-              <w:t>TB-4</w:t>
+              <w:t>TM-4</w:t>
             </w:r>
           </w:p>
         </w:tc>
@@ -3832,228 +3686,13 @@
               <w:rPr>
                 <w:sz w:val="20"/>
               </w:rPr>
-              <w:t>New comments -&gt; flat array -&gt; tree rebuilds -&gt; React re-renders.</w:t>
+              <w:t>Reply sets parent_id to the target comment's id for correct nesting.</w:t>
             </w:r>
           </w:p>
         </w:tc>
       </w:tr>
     </w:tbl>
     <w:p/>
-    <w:p>
-      <w:pPr>
-        <w:pStyle w:val="Heading2"/>
-      </w:pPr>
-      <w:r>
-        <w:t>State Management Rules</w:t>
-      </w:r>
-    </w:p>
-    <w:tbl>
-      <w:tblPr>
-        <w:tblStyle w:val="LightGrid-Accent1"/>
-        <w:tblW w:type="auto" w:w="0"/>
-        <w:jc w:val="center"/>
-        <w:tblLook w:firstColumn="1" w:firstRow="1" w:lastColumn="0" w:lastRow="0" w:noHBand="0" w:noVBand="1" w:val="04A0"/>
-      </w:tblPr>
-      <w:tblGrid>
-        <w:gridCol w:w="4320"/>
-        <w:gridCol w:w="4320"/>
-      </w:tblGrid>
-      <w:tr>
-        <w:tc>
-          <w:tcPr>
-            <w:tcW w:type="dxa" w:w="4320"/>
-          </w:tcPr>
-          <w:p>
-            <w:r>
-              <w:rPr>
-                <w:b/>
-                <w:sz w:val="20"/>
-              </w:rPr>
-              <w:t>#</w:t>
-            </w:r>
-          </w:p>
-        </w:tc>
-        <w:tc>
-          <w:tcPr>
-            <w:tcW w:type="dxa" w:w="4320"/>
-          </w:tcPr>
-          <w:p>
-            <w:r>
-              <w:rPr>
-                <w:b/>
-                <w:sz w:val="20"/>
-              </w:rPr>
-              <w:t>Rule</w:t>
-            </w:r>
-          </w:p>
-        </w:tc>
-      </w:tr>
-      <w:tr>
-        <w:tc>
-          <w:tcPr>
-            <w:tcW w:type="dxa" w:w="4320"/>
-          </w:tcPr>
-          <w:p>
-            <w:r>
-              <w:rPr>
-                <w:sz w:val="20"/>
-              </w:rPr>
-              <w:t>SM-1</w:t>
-            </w:r>
-          </w:p>
-        </w:tc>
-        <w:tc>
-          <w:tcPr>
-            <w:tcW w:type="dxa" w:w="4320"/>
-          </w:tcPr>
-          <w:p>
-            <w:r>
-              <w:rPr>
-                <w:sz w:val="20"/>
-              </w:rPr>
-              <w:t>All comments in React useState&lt;Comment[]&gt; (client-side).</w:t>
-            </w:r>
-          </w:p>
-        </w:tc>
-      </w:tr>
-      <w:tr>
-        <w:tc>
-          <w:tcPr>
-            <w:tcW w:type="dxa" w:w="4320"/>
-          </w:tcPr>
-          <w:p>
-            <w:r>
-              <w:rPr>
-                <w:sz w:val="20"/>
-              </w:rPr>
-              <w:t>SM-2</w:t>
-            </w:r>
-          </w:p>
-        </w:tc>
-        <w:tc>
-          <w:tcPr>
-            <w:tcW w:type="dxa" w:w="4320"/>
-          </w:tcPr>
-          <w:p>
-            <w:r>
-              <w:rPr>
-                <w:sz w:val="20"/>
-              </w:rPr>
-              <w:t>New comment appends to flat array with unique generated id.</w:t>
-            </w:r>
-          </w:p>
-        </w:tc>
-      </w:tr>
-      <w:tr>
-        <w:tc>
-          <w:tcPr>
-            <w:tcW w:type="dxa" w:w="4320"/>
-          </w:tcPr>
-          <w:p>
-            <w:r>
-              <w:rPr>
-                <w:sz w:val="20"/>
-              </w:rPr>
-              <w:t>SM-3</w:t>
-            </w:r>
-          </w:p>
-        </w:tc>
-        <w:tc>
-          <w:tcPr>
-            <w:tcW w:type="dxa" w:w="4320"/>
-          </w:tcPr>
-          <w:p>
-            <w:r>
-              <w:rPr>
-                <w:sz w:val="20"/>
-              </w:rPr>
-              <w:t>buildCommentTree() called each render to rebuild tree.</w:t>
-            </w:r>
-          </w:p>
-        </w:tc>
-      </w:tr>
-      <w:tr>
-        <w:tc>
-          <w:tcPr>
-            <w:tcW w:type="dxa" w:w="4320"/>
-          </w:tcPr>
-          <w:p>
-            <w:r>
-              <w:rPr>
-                <w:sz w:val="20"/>
-              </w:rPr>
-              <w:t>SM-4</w:t>
-            </w:r>
-          </w:p>
-        </w:tc>
-        <w:tc>
-          <w:tcPr>
-            <w:tcW w:type="dxa" w:w="4320"/>
-          </w:tcPr>
-          <w:p>
-            <w:r>
-              <w:rPr>
-                <w:sz w:val="20"/>
-              </w:rPr>
-              <w:t>Upvote/accept reset on page reload (client-side state).</w:t>
-            </w:r>
-          </w:p>
-        </w:tc>
-      </w:tr>
-    </w:tbl>
-    <w:p/>
-    <w:p>
-      <w:pPr>
-        <w:jc w:val="center"/>
-      </w:pPr>
-      <w:r>
-        <w:drawing>
-          <wp:inline xmlns:a="http://schemas.openxmlformats.org/drawingml/2006/main" xmlns:pic="http://schemas.openxmlformats.org/drawingml/2006/picture">
-            <wp:extent cx="5029200" cy="2789634"/>
-            <wp:docPr id="10" name="Picture 10"/>
-            <wp:cNvGraphicFramePr>
-              <a:graphicFrameLocks noChangeAspect="1"/>
-            </wp:cNvGraphicFramePr>
-            <a:graphic>
-              <a:graphicData uri="http://schemas.openxmlformats.org/drawingml/2006/picture">
-                <pic:pic>
-                  <pic:nvPicPr>
-                    <pic:cNvPr id="0" name="13-feedback-new-comment.png"/>
-                    <pic:cNvPicPr/>
-                  </pic:nvPicPr>
-                  <pic:blipFill>
-                    <a:blip r:embed="rId18"/>
-                    <a:stretch>
-                      <a:fillRect/>
-                    </a:stretch>
-                  </pic:blipFill>
-                  <pic:spPr>
-                    <a:xfrm>
-                      <a:off x="0" y="0"/>
-                      <a:ext cx="5029200" cy="2789634"/>
-                    </a:xfrm>
-                    <a:prstGeom prst="rect"/>
-                  </pic:spPr>
-                </pic:pic>
-              </a:graphicData>
-            </a:graphic>
-          </wp:inline>
-        </w:drawing>
-      </w:r>
-    </w:p>
-    <w:p>
-      <w:pPr>
-        <w:jc w:val="center"/>
-      </w:pPr>
-      <w:r>
-        <w:rPr>
-          <w:i/>
-          <w:color w:val="646464"/>
-          <w:sz w:val="18"/>
-        </w:rPr>
-        <w:t>Figure 10: Newly posted mentor comment at bottom of thread</w:t>
-      </w:r>
-    </w:p>
     <w:p>
       <w:r>
         <w:br w:type="page"/>
@@ -4064,7 +3703,7 @@
         <w:pStyle w:val="Heading1"/>
       </w:pPr>
       <w:r>
-        <w:t>UI 4: Interactive Guidance Thread (/guidance/[projectId])</w:t>
+        <w:t>UI 4: Guidance Thread — Interactive (/guidance/[projectId])</w:t>
       </w:r>
     </w:p>
     <w:p>
@@ -4083,7 +3722,7 @@
               <a:graphicData uri="http://schemas.openxmlformats.org/drawingml/2006/picture">
                 <pic:pic>
                   <pic:nvPicPr>
-                    <pic:cNvPr id="0" name="14-guidance-interactive.png"/>
+                    <pic:cNvPr id="0" name="15-guidance-interactive.png"/>
                     <pic:cNvPicPr/>
                   </pic:nvPicPr>
                   <pic:blipFill>
@@ -4116,7 +3755,7 @@
           <w:color w:val="646464"/>
           <w:sz w:val="18"/>
         </w:rPr>
-        <w:t>Figure 11: Interactive guidance with comment form, mentor badges, dates, code blocks</w:t>
+        <w:t>Figure 11: Interactive Guidance Thread with Add Guidance Comment form</w:t>
       </w:r>
     </w:p>
     <w:p>
@@ -4178,6 +3817,62 @@
               <w:rPr>
                 <w:sz w:val="20"/>
               </w:rPr>
+              <w:t>DR-6</w:t>
+            </w:r>
+          </w:p>
+        </w:tc>
+        <w:tc>
+          <w:tcPr>
+            <w:tcW w:type="dxa" w:w="4320"/>
+          </w:tcPr>
+          <w:p>
+            <w:r>
+              <w:rPr>
+                <w:sz w:val="20"/>
+              </w:rPr>
+              <w:t>Heading: "Guidance Thread" with projectId in &lt;code&gt; tag in subtitle.</w:t>
+            </w:r>
+          </w:p>
+        </w:tc>
+      </w:tr>
+      <w:tr>
+        <w:tc>
+          <w:tcPr>
+            <w:tcW w:type="dxa" w:w="4320"/>
+          </w:tcPr>
+          <w:p>
+            <w:r>
+              <w:rPr>
+                <w:sz w:val="20"/>
+              </w:rPr>
+              <w:t>DR-7</w:t>
+            </w:r>
+          </w:p>
+        </w:tc>
+        <w:tc>
+          <w:tcPr>
+            <w:tcW w:type="dxa" w:w="4320"/>
+          </w:tcPr>
+          <w:p>
+            <w:r>
+              <w:rPr>
+                <w:sz w:val="20"/>
+              </w:rPr>
+              <w:t>Dynamic route: /guidance/[projectId] accepts any project ID in URL.</w:t>
+            </w:r>
+          </w:p>
+        </w:tc>
+      </w:tr>
+      <w:tr>
+        <w:tc>
+          <w:tcPr>
+            <w:tcW w:type="dxa" w:w="4320"/>
+          </w:tcPr>
+          <w:p>
+            <w:r>
+              <w:rPr>
+                <w:sz w:val="20"/>
+              </w:rPr>
               <w:t>DR-8</w:t>
             </w:r>
           </w:p>
@@ -4191,7 +3886,7 @@
               <w:rPr>
                 <w:sz w:val="20"/>
               </w:rPr>
-              <w:t>"Guidance Thread" heading with projectId in &lt;code&gt; tag.</w:t>
+              <w:t>Each comment shows created_at date stamp on the right side of the header.</w:t>
             </w:r>
           </w:p>
         </w:tc>
@@ -4219,63 +3914,7 @@
               <w:rPr>
                 <w:sz w:val="20"/>
               </w:rPr>
-              <w:t>Dynamic route: /guidance/[projectId] accepts any project ID.</w:t>
-            </w:r>
-          </w:p>
-        </w:tc>
-      </w:tr>
-      <w:tr>
-        <w:tc>
-          <w:tcPr>
-            <w:tcW w:type="dxa" w:w="4320"/>
-          </w:tcPr>
-          <w:p>
-            <w:r>
-              <w:rPr>
-                <w:sz w:val="20"/>
-              </w:rPr>
-              <w:t>DR-10</w:t>
-            </w:r>
-          </w:p>
-        </w:tc>
-        <w:tc>
-          <w:tcPr>
-            <w:tcW w:type="dxa" w:w="4320"/>
-          </w:tcPr>
-          <w:p>
-            <w:r>
-              <w:rPr>
-                <w:sz w:val="20"/>
-              </w:rPr>
-              <w:t>Comments show created_at date stamps on the right.</w:t>
-            </w:r>
-          </w:p>
-        </w:tc>
-      </w:tr>
-      <w:tr>
-        <w:tc>
-          <w:tcPr>
-            <w:tcW w:type="dxa" w:w="4320"/>
-          </w:tcPr>
-          <w:p>
-            <w:r>
-              <w:rPr>
-                <w:sz w:val="20"/>
-              </w:rPr>
-              <w:t>DR-11</w:t>
-            </w:r>
-          </w:p>
-        </w:tc>
-        <w:tc>
-          <w:tcPr>
-            <w:tcW w:type="dxa" w:w="4320"/>
-          </w:tcPr>
-          <w:p>
-            <w:r>
-              <w:rPr>
-                <w:sz w:val="20"/>
-              </w:rPr>
-              <w:t>Mentor badge (amber), OP badge (blue), syntax-highlighted code.</w:t>
+              <w:t>Same recursive nesting, role badges, Markdown/code as Feedback Thread.</w:t>
             </w:r>
           </w:p>
         </w:tc>
@@ -4287,7 +3926,7 @@
         <w:pStyle w:val="Heading2"/>
       </w:pPr>
       <w:r>
-        <w:t>Comment Form Rules</w:t>
+        <w:t>Interactive Features</w:t>
       </w:r>
     </w:p>
     <w:tbl>
@@ -4341,7 +3980,7 @@
               <w:rPr>
                 <w:sz w:val="20"/>
               </w:rPr>
-              <w:t>GF-1</w:t>
+              <w:t>GI-1</w:t>
             </w:r>
           </w:p>
         </w:tc>
@@ -4354,7 +3993,7 @@
               <w:rPr>
                 <w:sz w:val="20"/>
               </w:rPr>
-              <w:t>"Add Guidance Comment" form: name input, role selector, Markdown textarea.</w:t>
+              <w:t>"Add Guidance Comment" form at top — name, role, textarea, Post Comment.</w:t>
             </w:r>
           </w:p>
         </w:tc>
@@ -4369,7 +4008,7 @@
               <w:rPr>
                 <w:sz w:val="20"/>
               </w:rPr>
-              <w:t>GF-2</w:t>
+              <w:t>GI-2</w:t>
             </w:r>
           </w:p>
         </w:tc>
@@ -4382,7 +4021,7 @@
               <w:rPr>
                 <w:sz w:val="20"/>
               </w:rPr>
-              <w:t>Posts root comments with auto-generated id, project_id, created_at.</w:t>
+              <w:t>Reply button on every comment opens inline form with Post Reply.</w:t>
             </w:r>
           </w:p>
         </w:tc>
@@ -4397,7 +4036,7 @@
               <w:rPr>
                 <w:sz w:val="20"/>
               </w:rPr>
-              <w:t>GF-3</w:t>
+              <w:t>GI-3</w:t>
             </w:r>
           </w:p>
         </w:tc>
@@ -4410,58 +4049,7 @@
               <w:rPr>
                 <w:sz w:val="20"/>
               </w:rPr>
-              <w:t>Total comments counter updates in real-time.</w:t>
-            </w:r>
-          </w:p>
-        </w:tc>
-      </w:tr>
-    </w:tbl>
-    <w:p/>
-    <w:p>
-      <w:pPr>
-        <w:pStyle w:val="Heading2"/>
-      </w:pPr>
-      <w:r>
-        <w:t>Reply Form Rules</w:t>
-      </w:r>
-    </w:p>
-    <w:tbl>
-      <w:tblPr>
-        <w:tblStyle w:val="LightGrid-Accent1"/>
-        <w:tblW w:type="auto" w:w="0"/>
-        <w:jc w:val="center"/>
-        <w:tblLook w:firstColumn="1" w:firstRow="1" w:lastColumn="0" w:lastRow="0" w:noHBand="0" w:noVBand="1" w:val="04A0"/>
-      </w:tblPr>
-      <w:tblGrid>
-        <w:gridCol w:w="4320"/>
-        <w:gridCol w:w="4320"/>
-      </w:tblGrid>
-      <w:tr>
-        <w:tc>
-          <w:tcPr>
-            <w:tcW w:type="dxa" w:w="4320"/>
-          </w:tcPr>
-          <w:p>
-            <w:r>
-              <w:rPr>
-                <w:b/>
-                <w:sz w:val="20"/>
-              </w:rPr>
-              <w:t>#</w:t>
-            </w:r>
-          </w:p>
-        </w:tc>
-        <w:tc>
-          <w:tcPr>
-            <w:tcW w:type="dxa" w:w="4320"/>
-          </w:tcPr>
-          <w:p>
-            <w:r>
-              <w:rPr>
-                <w:b/>
-                <w:sz w:val="20"/>
-              </w:rPr>
-              <w:t>Rule</w:t>
+              <w:t>Upvote and Mark Accepted behave identically to Feedback Thread.</w:t>
             </w:r>
           </w:p>
         </w:tc>
@@ -4476,7 +4064,7 @@
               <w:rPr>
                 <w:sz w:val="20"/>
               </w:rPr>
-              <w:t>GR-1</w:t>
+              <w:t>GI-4</w:t>
             </w:r>
           </w:p>
         </w:tc>
@@ -4489,63 +4077,7 @@
               <w:rPr>
                 <w:sz w:val="20"/>
               </w:rPr>
-              <w:t>"Reply" button opens inline form. Replies nest via parent_id.</w:t>
-            </w:r>
-          </w:p>
-        </w:tc>
-      </w:tr>
-      <w:tr>
-        <w:tc>
-          <w:tcPr>
-            <w:tcW w:type="dxa" w:w="4320"/>
-          </w:tcPr>
-          <w:p>
-            <w:r>
-              <w:rPr>
-                <w:sz w:val="20"/>
-              </w:rPr>
-              <w:t>GR-2</w:t>
-            </w:r>
-          </w:p>
-        </w:tc>
-        <w:tc>
-          <w:tcPr>
-            <w:tcW w:type="dxa" w:w="4320"/>
-          </w:tcPr>
-          <w:p>
-            <w:r>
-              <w:rPr>
-                <w:sz w:val="20"/>
-              </w:rPr>
-              <w:t>Same interaction pattern as feedback thread.</w:t>
-            </w:r>
-          </w:p>
-        </w:tc>
-      </w:tr>
-      <w:tr>
-        <w:tc>
-          <w:tcPr>
-            <w:tcW w:type="dxa" w:w="4320"/>
-          </w:tcPr>
-          <w:p>
-            <w:r>
-              <w:rPr>
-                <w:sz w:val="20"/>
-              </w:rPr>
-              <w:t>GR-3</w:t>
-            </w:r>
-          </w:p>
-        </w:tc>
-        <w:tc>
-          <w:tcPr>
-            <w:tcW w:type="dxa" w:w="4320"/>
-          </w:tcPr>
-          <w:p>
-            <w:r>
-              <w:rPr>
-                <w:sz w:val="20"/>
-              </w:rPr>
-              <w:t>Reply form includes name, role selector, Markdown textarea.</w:t>
+              <w:t>Comment count stats shown at bottom.</w:t>
             </w:r>
           </w:p>
         </w:tc>
@@ -4554,62 +4086,10 @@
     <w:p/>
     <w:p>
       <w:pPr>
-        <w:jc w:val="center"/>
-      </w:pPr>
-      <w:r>
-        <w:drawing>
-          <wp:inline xmlns:a="http://schemas.openxmlformats.org/drawingml/2006/main" xmlns:pic="http://schemas.openxmlformats.org/drawingml/2006/picture">
-            <wp:extent cx="5029200" cy="2789634"/>
-            <wp:docPr id="12" name="Picture 12"/>
-            <wp:cNvGraphicFramePr>
-              <a:graphicFrameLocks noChangeAspect="1"/>
-            </wp:cNvGraphicFramePr>
-            <a:graphic>
-              <a:graphicData uri="http://schemas.openxmlformats.org/drawingml/2006/picture">
-                <pic:pic>
-                  <pic:nvPicPr>
-                    <pic:cNvPr id="0" name="15-guidance-reply-form.png"/>
-                    <pic:cNvPicPr/>
-                  </pic:nvPicPr>
-                  <pic:blipFill>
-                    <a:blip r:embed="rId20"/>
-                    <a:stretch>
-                      <a:fillRect/>
-                    </a:stretch>
-                  </pic:blipFill>
-                  <pic:spPr>
-                    <a:xfrm>
-                      <a:off x="0" y="0"/>
-                      <a:ext cx="5029200" cy="2789634"/>
-                    </a:xfrm>
-                    <a:prstGeom prst="rect"/>
-                  </pic:spPr>
-                </pic:pic>
-              </a:graphicData>
-            </a:graphic>
-          </wp:inline>
-        </w:drawing>
-      </w:r>
-    </w:p>
-    <w:p>
-      <w:pPr>
-        <w:jc w:val="center"/>
-      </w:pPr>
-      <w:r>
-        <w:rPr>
-          <w:i/>
-          <w:color w:val="646464"/>
-          <w:sz w:val="18"/>
-        </w:rPr>
-        <w:t>Figure 12: Reply form on Dr. Fernando mentor comment - "Reply" changed to "Cancel"</w:t>
-      </w:r>
-    </w:p>
-    <w:p>
-      <w:pPr>
         <w:pStyle w:val="Heading2"/>
       </w:pPr>
       <w:r>
-        <w:t>Data Fetch Rules</w:t>
+        <w:t>Data Flow Rules</w:t>
       </w:r>
     </w:p>
     <w:tbl>
@@ -4676,7 +4156,7 @@
               <w:rPr>
                 <w:sz w:val="20"/>
               </w:rPr>
-              <w:t>Initial comments fetched server-side (async Server Component).</w:t>
+              <w:t>Initial comments fetched server-side via fetchCommentsByProjectId() (async Server Component).</w:t>
             </w:r>
           </w:p>
         </w:tc>
@@ -4704,7 +4184,7 @@
               <w:rPr>
                 <w:sz w:val="20"/>
               </w:rPr>
-              <w:t>Empty state: "No guidance comments yet."</w:t>
+              <w:t>Fetched data passed as props to InteractiveGuidanceClient (Client Component boundary).</w:t>
             </w:r>
           </w:p>
         </w:tc>
@@ -4732,13 +4212,65 @@
               <w:rPr>
                 <w:sz w:val="20"/>
               </w:rPr>
-              <w:t>Same buildCommentTree() O(n) algorithm as feedback thread.</w:t>
+              <w:t>New comments added client-side with same useState + buildCommentTree pattern.</w:t>
             </w:r>
           </w:p>
         </w:tc>
       </w:tr>
     </w:tbl>
     <w:p/>
+    <w:p>
+      <w:pPr>
+        <w:jc w:val="center"/>
+      </w:pPr>
+      <w:r>
+        <w:drawing>
+          <wp:inline xmlns:a="http://schemas.openxmlformats.org/drawingml/2006/main" xmlns:pic="http://schemas.openxmlformats.org/drawingml/2006/picture">
+            <wp:extent cx="5029200" cy="2789634"/>
+            <wp:docPr id="12" name="Picture 12"/>
+            <wp:cNvGraphicFramePr>
+              <a:graphicFrameLocks noChangeAspect="1"/>
+            </wp:cNvGraphicFramePr>
+            <a:graphic>
+              <a:graphicData uri="http://schemas.openxmlformats.org/drawingml/2006/picture">
+                <pic:pic>
+                  <pic:nvPicPr>
+                    <pic:cNvPr id="0" name="16-guidance-reply-form.png"/>
+                    <pic:cNvPicPr/>
+                  </pic:nvPicPr>
+                  <pic:blipFill>
+                    <a:blip r:embed="rId20"/>
+                    <a:stretch>
+                      <a:fillRect/>
+                    </a:stretch>
+                  </pic:blipFill>
+                  <pic:spPr>
+                    <a:xfrm>
+                      <a:off x="0" y="0"/>
+                      <a:ext cx="5029200" cy="2789634"/>
+                    </a:xfrm>
+                    <a:prstGeom prst="rect"/>
+                  </pic:spPr>
+                </pic:pic>
+              </a:graphicData>
+            </a:graphic>
+          </wp:inline>
+        </w:drawing>
+      </w:r>
+    </w:p>
+    <w:p>
+      <w:pPr>
+        <w:jc w:val="center"/>
+      </w:pPr>
+      <w:r>
+        <w:rPr>
+          <w:i/>
+          <w:color w:val="646464"/>
+          <w:sz w:val="18"/>
+        </w:rPr>
+        <w:t>Figure 12: Inline reply form expanded under Dr. Fernando's mentor comment</w:t>
+      </w:r>
+    </w:p>
     <w:p>
       <w:r>
         <w:br w:type="page"/>
@@ -4816,7 +4348,7 @@
               <w:rPr>
                 <w:sz w:val="20"/>
               </w:rPr>
-              <w:t>React framework with Server/Client Components</w:t>
+              <w:t>Server/Client Components, dynamic routing</w:t>
             </w:r>
           </w:p>
         </w:tc>
@@ -4844,7 +4376,7 @@
               <w:rPr>
                 <w:sz w:val="20"/>
               </w:rPr>
-              <w:t>UI library with useState, useCallback hooks</w:t>
+              <w:t>UI with useState, useCallback, useFormState, useFormStatus</w:t>
             </w:r>
           </w:p>
         </w:tc>
@@ -5012,13 +4544,63 @@
               <w:rPr>
                 <w:sz w:val="20"/>
               </w:rPr>
-              <w:t>Code block syntax highlighting (Prism)</w:t>
+              <w:t>Code block syntax highlighting (Prism/oneLight)</w:t>
             </w:r>
           </w:p>
         </w:tc>
       </w:tr>
     </w:tbl>
     <w:p/>
+    <w:p>
+      <w:pPr>
+        <w:pStyle w:val="Heading1"/>
+      </w:pPr>
+      <w:r>
+        <w:t>Updated Project Structure</w:t>
+      </w:r>
+    </w:p>
+    <w:p>
+      <w:r>
+        <w:rPr>
+          <w:b w:val="0"/>
+        </w:rPr>
+        <w:t>src/</w:t>
+        <w:br/>
+        <w:t>+-- app/</w:t>
+        <w:br/>
+        <w:t>|   +-- posts/new/page.tsx              Post form page</w:t>
+        <w:br/>
+        <w:t>|   +-- feedback/page.tsx               Interactive feedback page</w:t>
+        <w:br/>
+        <w:t>|   +-- guidance/[projectId]/</w:t>
+        <w:br/>
+        <w:t>|       +-- page.tsx                    Server Component (fetches data)</w:t>
+        <w:br/>
+        <w:t>|       +-- InteractiveGuidanceClient  [NEW] Client bridge wrapper</w:t>
+        <w:br/>
+        <w:t>+-- components/</w:t>
+        <w:br/>
+        <w:t xml:space="preserve">    +-- post-form/</w:t>
+        <w:br/>
+        <w:t xml:space="preserve">    |   +-- PostForm.tsx / PostFormClient.tsx / TagPicker.tsx / schema.ts</w:t>
+        <w:br/>
+        <w:t xml:space="preserve">    +-- feedback-thread/</w:t>
+        <w:br/>
+        <w:t xml:space="preserve">    |   +-- InteractiveFeedback.tsx     [NEW] Comment form + state</w:t>
+        <w:br/>
+        <w:t xml:space="preserve">    |   +-- InteractiveCommentNode.tsx  [NEW] Node + Reply button</w:t>
+        <w:br/>
+        <w:t xml:space="preserve">    |   +-- types.ts (buildCommentTree)</w:t>
+        <w:br/>
+        <w:t xml:space="preserve">    +-- guidance-thread/</w:t>
+        <w:br/>
+        <w:t xml:space="preserve">        +-- InteractiveGuidance.tsx     [NEW] Comment form + state</w:t>
+        <w:br/>
+        <w:t xml:space="preserve">        +-- InteractiveGuidanceNode.tsx [NEW] Node + Reply button</w:t>
+        <w:br/>
+        <w:t xml:space="preserve">        +-- data.ts (fetchComments + buildTree)</w:t>
+      </w:r>
+    </w:p>
     <w:p>
       <w:pPr>
         <w:pStyle w:val="Heading1"/>
@@ -5124,104 +4706,8 @@
           </w:p>
         </w:tc>
       </w:tr>
-      <w:tr>
-        <w:tc>
-          <w:tcPr>
-            <w:tcW w:type="dxa" w:w="4320"/>
-          </w:tcPr>
-          <w:p>
-            <w:r>
-              <w:rPr>
-                <w:sz w:val="20"/>
-              </w:rPr>
-              <w:t>Commits</w:t>
-            </w:r>
-          </w:p>
-        </w:tc>
-        <w:tc>
-          <w:tcPr>
-            <w:tcW w:type="dxa" w:w="4320"/>
-          </w:tcPr>
-          <w:p>
-            <w:r>
-              <w:rPr>
-                <w:sz w:val="20"/>
-              </w:rPr>
-              <w:t>Meaningful commits tracking each feature</w:t>
-            </w:r>
-          </w:p>
-        </w:tc>
-      </w:tr>
     </w:tbl>
     <w:p/>
-    <w:p>
-      <w:pPr>
-        <w:pStyle w:val="Heading1"/>
-      </w:pPr>
-      <w:r>
-        <w:t>Project Structure</w:t>
-      </w:r>
-    </w:p>
-    <w:p>
-      <w:r>
-        <w:rPr>
-          <w:b w:val="0"/>
-        </w:rPr>
-        <w:t>src/</w:t>
-        <w:br/>
-        <w:t xml:space="preserve">  app/</w:t>
-        <w:br/>
-        <w:t xml:space="preserve">    layout.tsx                        - Root layout (Server Component)</w:t>
-        <w:br/>
-        <w:t xml:space="preserve">    page.tsx                          - Home page</w:t>
-        <w:br/>
-        <w:t xml:space="preserve">    posts/new/page.tsx                - Project Idea Form page</w:t>
-        <w:br/>
-        <w:t xml:space="preserve">    feedback/page.tsx                 - Interactive Feedback Thread</w:t>
-        <w:br/>
-        <w:t xml:space="preserve">    guidance/[projectId]/</w:t>
-        <w:br/>
-        <w:t xml:space="preserve">      page.tsx                        - Guidance page (Server -&gt; Client)</w:t>
-        <w:br/>
-        <w:t xml:space="preserve">      InteractiveGuidanceClient.tsx   - Client bridge component</w:t>
-        <w:br/>
-        <w:t xml:space="preserve">  components/</w:t>
-        <w:br/>
-        <w:t xml:space="preserve">    post-form/</w:t>
-        <w:br/>
-        <w:t xml:space="preserve">      PostForm.tsx                    - Form wrapper + action handler</w:t>
-        <w:br/>
-        <w:t xml:space="preserve">      PostFormClient.tsx              - Interactive form (useFormState)</w:t>
-        <w:br/>
-        <w:t xml:space="preserve">      TagPicker.tsx                   - Multi-select tag picker</w:t>
-        <w:br/>
-        <w:t xml:space="preserve">      schema.ts                      - Zod validation schema</w:t>
-        <w:br/>
-        <w:t xml:space="preserve">    feedback-thread/</w:t>
-        <w:br/>
-        <w:t xml:space="preserve">      InteractiveFeedback.tsx         - State manager + comment form</w:t>
-        <w:br/>
-        <w:t xml:space="preserve">      InteractiveCommentNode.tsx      - Recursive renderer + reply form</w:t>
-        <w:br/>
-        <w:t xml:space="preserve">      FeedbackThread.tsx              - Server Component (static)</w:t>
-        <w:br/>
-        <w:t xml:space="preserve">      CommentNode.tsx                 - Static comment renderer</w:t>
-        <w:br/>
-        <w:t xml:space="preserve">      types.ts                        - Types + buildCommentTree()</w:t>
-        <w:br/>
-        <w:t xml:space="preserve">    guidance-thread/</w:t>
-        <w:br/>
-        <w:t xml:space="preserve">      InteractiveGuidance.tsx          - State manager + comment form</w:t>
-        <w:br/>
-        <w:t xml:space="preserve">      InteractiveGuidanceNode.tsx      - Recursive renderer + reply form</w:t>
-        <w:br/>
-        <w:t xml:space="preserve">      GuidanceThread.tsx               - Server Component (static)</w:t>
-        <w:br/>
-        <w:t xml:space="preserve">      GuidanceCommentNode.tsx          - Static comment renderer</w:t>
-        <w:br/>
-        <w:t xml:space="preserve">      data.ts                          - Types + fetchComments + buildTree</w:t>
-      </w:r>
-    </w:p>
     <w:sectPr>
       <w:pgSz w:w="12240" w:h="15840"/>
       <w:pgMar w:top="1440" w:right="1800" w:bottom="1440" w:left="1800" w:header="720" w:footer="720" w:gutter="0"/>

</xml_diff>

<commit_message>
style: apply leader's dark/gold theme across Idea & Guidance module
</commit_message>
<xml_diff>
--- a/docs/Progress-1-UI-Business-Rules.docx
+++ b/docs/Progress-1-UI-Business-Rules.docx
@@ -1776,11 +1776,11 @@
               <a:graphicData uri="http://schemas.openxmlformats.org/drawingml/2006/picture">
                 <pic:pic>
                   <pic:nvPicPr>
-                    <pic:cNvPr id="0" name="02-validation-errors.png"/>
+                    <pic:cNvPr id="0" name="01-post-form-empty.png"/>
                     <pic:cNvPicPr/>
                   </pic:nvPicPr>
                   <pic:blipFill>
-                    <a:blip r:embed="rId10"/>
+                    <a:blip r:embed="rId9"/>
                     <a:stretch>
                       <a:fillRect/>
                     </a:stretch>
@@ -1832,7 +1832,7 @@
                     <pic:cNvPicPr/>
                   </pic:nvPicPr>
                   <pic:blipFill>
-                    <a:blip r:embed="rId11"/>
+                    <a:blip r:embed="rId10"/>
                     <a:stretch>
                       <a:fillRect/>
                     </a:stretch>
@@ -2055,7 +2055,7 @@
                     <pic:cNvPicPr/>
                   </pic:nvPicPr>
                   <pic:blipFill>
-                    <a:blip r:embed="rId12"/>
+                    <a:blip r:embed="rId11"/>
                     <a:stretch>
                       <a:fillRect/>
                     </a:stretch>
@@ -2107,7 +2107,7 @@
                     <pic:cNvPicPr/>
                   </pic:nvPicPr>
                   <pic:blipFill>
-                    <a:blip r:embed="rId13"/>
+                    <a:blip r:embed="rId12"/>
                     <a:stretch>
                       <a:fillRect/>
                     </a:stretch>
@@ -2498,7 +2498,7 @@
                     <pic:cNvPicPr/>
                   </pic:nvPicPr>
                   <pic:blipFill>
-                    <a:blip r:embed="rId14"/>
+                    <a:blip r:embed="rId13"/>
                     <a:stretch>
                       <a:fillRect/>
                     </a:stretch>
@@ -2960,7 +2960,7 @@
                     <pic:cNvPicPr/>
                   </pic:nvPicPr>
                   <pic:blipFill>
-                    <a:blip r:embed="rId15"/>
+                    <a:blip r:embed="rId14"/>
                     <a:stretch>
                       <a:fillRect/>
                     </a:stretch>
@@ -3012,7 +3012,7 @@
                     <pic:cNvPicPr/>
                   </pic:nvPicPr>
                   <pic:blipFill>
-                    <a:blip r:embed="rId16"/>
+                    <a:blip r:embed="rId15"/>
                     <a:stretch>
                       <a:fillRect/>
                     </a:stretch>
@@ -3311,7 +3311,7 @@
                     <pic:cNvPicPr/>
                   </pic:nvPicPr>
                   <pic:blipFill>
-                    <a:blip r:embed="rId17"/>
+                    <a:blip r:embed="rId16"/>
                     <a:stretch>
                       <a:fillRect/>
                     </a:stretch>
@@ -3363,7 +3363,7 @@
                     <pic:cNvPicPr/>
                   </pic:nvPicPr>
                   <pic:blipFill>
-                    <a:blip r:embed="rId18"/>
+                    <a:blip r:embed="rId17"/>
                     <a:stretch>
                       <a:fillRect/>
                     </a:stretch>
@@ -3726,7 +3726,7 @@
                     <pic:cNvPicPr/>
                   </pic:nvPicPr>
                   <pic:blipFill>
-                    <a:blip r:embed="rId19"/>
+                    <a:blip r:embed="rId18"/>
                     <a:stretch>
                       <a:fillRect/>
                     </a:stretch>
@@ -4239,7 +4239,7 @@
                     <pic:cNvPicPr/>
                   </pic:nvPicPr>
                   <pic:blipFill>
-                    <a:blip r:embed="rId20"/>
+                    <a:blip r:embed="rId19"/>
                     <a:stretch>
                       <a:fillRect/>
                     </a:stretch>

</xml_diff>